<commit_message>
Update supplementary files and formatting adjustments
</commit_message>
<xml_diff>
--- a/supplement/Falsification_Framework_TimeSeries_Supplementary_BalajiKoshti.docx
+++ b/supplement/Falsification_Framework_TimeSeries_Supplementary_BalajiKoshti.docx
@@ -69,7 +69,7 @@
           <w:rFonts w:ascii="Cambria" w:hAnsi="Cambria"/>
         </w:rPr>
         <w:pict w14:anchorId="528FA325">
-          <v:rect id="_x0000_i1127" style="width:0;height:1.5pt" o:hralign="center" o:hrstd="t" o:hr="t" fillcolor="#a0a0a0" stroked="f"/>
+          <v:rect id="_x0000_i1026" style="width:0;height:1.5pt" o:hralign="center" o:hrstd="t" o:hr="t" fillcolor="#a0a0a0" stroked="f"/>
         </w:pict>
       </w:r>
     </w:p>
@@ -113,7 +113,7 @@
           <w:rFonts w:ascii="Cambria" w:hAnsi="Cambria"/>
         </w:rPr>
         <w:pict w14:anchorId="0B5E4C14">
-          <v:rect id="_x0000_i1026" style="width:0;height:1.5pt" o:hralign="center" o:hrstd="t" o:hr="t" fillcolor="#a0a0a0" stroked="f"/>
+          <v:rect id="_x0000_i1027" style="width:0;height:1.5pt" o:hralign="center" o:hrstd="t" o:hr="t" fillcolor="#a0a0a0" stroked="f"/>
         </w:pict>
       </w:r>
     </w:p>
@@ -145,7 +145,7 @@
           <w:rFonts w:ascii="Cambria" w:hAnsi="Cambria"/>
         </w:rPr>
         <w:pict w14:anchorId="14D106FB">
-          <v:rect id="_x0000_i1027" style="width:0;height:1.5pt" o:hralign="center" o:hrstd="t" o:hr="t" fillcolor="#a0a0a0" stroked="f"/>
+          <v:rect id="_x0000_i1028" style="width:0;height:1.5pt" o:hralign="center" o:hrstd="t" o:hr="t" fillcolor="#a0a0a0" stroked="f"/>
         </w:pict>
       </w:r>
     </w:p>
@@ -224,7 +224,7 @@
           <w:rFonts w:ascii="Cambria" w:hAnsi="Cambria"/>
         </w:rPr>
         <w:pict w14:anchorId="2DE30DAD">
-          <v:rect id="_x0000_i1028" style="width:0;height:1.5pt" o:hralign="center" o:hrstd="t" o:hr="t" fillcolor="#a0a0a0" stroked="f"/>
+          <v:rect id="_x0000_i1029" style="width:0;height:1.5pt" o:hralign="center" o:hrstd="t" o:hr="t" fillcolor="#a0a0a0" stroked="f"/>
         </w:pict>
       </w:r>
     </w:p>
@@ -412,20 +412,7 @@
           <w:rFonts w:ascii="Cambria" w:hAnsi="Cambria"/>
         </w:rPr>
         <w:br/>
-      </w:r>
-      <w:proofErr w:type="spellStart"/>
-      <w:r>
-        <w:rPr>
-          <w:rFonts w:ascii="Cambria" w:hAnsi="Cambria"/>
-        </w:rPr>
-        <w:t>Legends</w:t>
-      </w:r>
-      <w:proofErr w:type="spellEnd"/>
-      <w:r>
-        <w:rPr>
-          <w:rFonts w:ascii="Cambria" w:hAnsi="Cambria"/>
-        </w:rPr>
-        <w:t xml:space="preserve"> corresponding to supplementary figures referenced throughout this document.</w:t>
+        <w:t>Legends corresponding to supplementary figures referenced throughout this document.</w:t>
       </w:r>
     </w:p>
     <w:p>
@@ -439,21 +426,6 @@
           <w:rFonts w:ascii="Cambria" w:hAnsi="Cambria"/>
         </w:rPr>
         <w:pict w14:anchorId="42FC6CAF">
-          <v:rect id="_x0000_i1029" style="width:0;height:1.5pt" o:hralign="center" o:hrstd="t" o:hr="t" fillcolor="#a0a0a0" stroked="f"/>
-        </w:pict>
-      </w:r>
-    </w:p>
-    <w:p>
-      <w:pPr>
-        <w:rPr>
-          <w:rFonts w:ascii="Cambria" w:hAnsi="Cambria"/>
-        </w:rPr>
-      </w:pPr>
-      <w:r>
-        <w:rPr>
-          <w:rFonts w:ascii="Cambria" w:hAnsi="Cambria"/>
-        </w:rPr>
-        <w:pict w14:anchorId="033F4EF6">
           <v:rect id="_x0000_i1030" style="width:0;height:1.5pt" o:hralign="center" o:hrstd="t" o:hr="t" fillcolor="#a0a0a0" stroked="f"/>
         </w:pict>
       </w:r>
@@ -467,6 +439,21 @@
       <w:r>
         <w:rPr>
           <w:rFonts w:ascii="Cambria" w:hAnsi="Cambria"/>
+        </w:rPr>
+        <w:pict w14:anchorId="033F4EF6">
+          <v:rect id="_x0000_i1031" style="width:0;height:1.5pt" o:hralign="center" o:hrstd="t" o:hr="t" fillcolor="#a0a0a0" stroked="f"/>
+        </w:pict>
+      </w:r>
+    </w:p>
+    <w:p>
+      <w:pPr>
+        <w:rPr>
+          <w:rFonts w:ascii="Cambria" w:hAnsi="Cambria"/>
+        </w:rPr>
+      </w:pPr>
+      <w:r>
+        <w:rPr>
+          <w:rFonts w:ascii="Cambria" w:hAnsi="Cambria"/>
           <w:b/>
           <w:bCs/>
         </w:rPr>
@@ -484,7 +471,7 @@
           <w:rFonts w:ascii="Cambria" w:hAnsi="Cambria"/>
         </w:rPr>
         <w:pict w14:anchorId="19A70963">
-          <v:rect id="_x0000_i1031" style="width:0;height:1.5pt" o:hralign="center" o:hrstd="t" o:hr="t" fillcolor="#a0a0a0" stroked="f"/>
+          <v:rect id="_x0000_i1032" style="width:0;height:1.5pt" o:hralign="center" o:hrstd="t" o:hr="t" fillcolor="#a0a0a0" stroked="f"/>
         </w:pict>
       </w:r>
     </w:p>
@@ -708,7 +695,7 @@
           <w:rFonts w:ascii="Cambria" w:hAnsi="Cambria"/>
         </w:rPr>
         <w:pict w14:anchorId="5D6E36AC">
-          <v:rect id="_x0000_i1032" style="width:0;height:1.5pt" o:hralign="center" o:hrstd="t" o:hr="t" fillcolor="#a0a0a0" stroked="f"/>
+          <v:rect id="_x0000_i1033" style="width:0;height:1.5pt" o:hralign="center" o:hrstd="t" o:hr="t" fillcolor="#a0a0a0" stroked="f"/>
         </w:pict>
       </w:r>
     </w:p>
@@ -1040,7 +1027,7 @@
         </w:rPr>
         <w:lastRenderedPageBreak/>
         <w:pict w14:anchorId="68345699">
-          <v:rect id="_x0000_i1033" style="width:0;height:1.5pt" o:hralign="center" o:hrstd="t" o:hr="t" fillcolor="#a0a0a0" stroked="f"/>
+          <v:rect id="_x0000_i1034" style="width:0;height:1.5pt" o:hralign="center" o:hrstd="t" o:hr="t" fillcolor="#a0a0a0" stroked="f"/>
         </w:pict>
       </w:r>
     </w:p>
@@ -1163,7 +1150,7 @@
           <w:rFonts w:ascii="Cambria" w:hAnsi="Cambria"/>
         </w:rPr>
         <w:pict w14:anchorId="3AEB1DEC">
-          <v:rect id="_x0000_i1034" style="width:0;height:1.5pt" o:hralign="center" o:hrstd="t" o:hr="t" fillcolor="#a0a0a0" stroked="f"/>
+          <v:rect id="_x0000_i1035" style="width:0;height:1.5pt" o:hralign="center" o:hrstd="t" o:hr="t" fillcolor="#a0a0a0" stroked="f"/>
         </w:pict>
       </w:r>
     </w:p>
@@ -1221,7 +1208,7 @@
           <w:rFonts w:ascii="Cambria" w:hAnsi="Cambria"/>
         </w:rPr>
         <w:pict w14:anchorId="68E7C79D">
-          <v:rect id="_x0000_i1035" style="width:0;height:1.5pt" o:hralign="center" o:hrstd="t" o:hr="t" fillcolor="#a0a0a0" stroked="f"/>
+          <v:rect id="_x0000_i1036" style="width:0;height:1.5pt" o:hralign="center" o:hrstd="t" o:hr="t" fillcolor="#a0a0a0" stroked="f"/>
         </w:pict>
       </w:r>
     </w:p>
@@ -1331,7 +1318,7 @@
           <w:rFonts w:ascii="Cambria" w:hAnsi="Cambria"/>
         </w:rPr>
         <w:pict w14:anchorId="1EE1CCEB">
-          <v:rect id="_x0000_i1036" style="width:0;height:1.5pt" o:hralign="center" o:hrstd="t" o:hr="t" fillcolor="#a0a0a0" stroked="f"/>
+          <v:rect id="_x0000_i1037" style="width:0;height:1.5pt" o:hralign="center" o:hrstd="t" o:hr="t" fillcolor="#a0a0a0" stroked="f"/>
         </w:pict>
       </w:r>
     </w:p>
@@ -1457,7 +1444,7 @@
           <w:rFonts w:ascii="Cambria" w:hAnsi="Cambria"/>
         </w:rPr>
         <w:pict w14:anchorId="577F2903">
-          <v:rect id="_x0000_i1037" style="width:0;height:1.5pt" o:hralign="center" o:hrstd="t" o:hr="t" fillcolor="#a0a0a0" stroked="f"/>
+          <v:rect id="_x0000_i1038" style="width:0;height:1.5pt" o:hralign="center" o:hrstd="t" o:hr="t" fillcolor="#a0a0a0" stroked="f"/>
         </w:pict>
       </w:r>
     </w:p>
@@ -1670,7 +1657,7 @@
           <w:rFonts w:ascii="Cambria" w:hAnsi="Cambria"/>
         </w:rPr>
         <w:pict w14:anchorId="668C5F1F">
-          <v:rect id="_x0000_i1038" style="width:0;height:1.5pt" o:hralign="center" o:hrstd="t" o:hr="t" fillcolor="#a0a0a0" stroked="f"/>
+          <v:rect id="_x0000_i1039" style="width:0;height:1.5pt" o:hralign="center" o:hrstd="t" o:hr="t" fillcolor="#a0a0a0" stroked="f"/>
         </w:pict>
       </w:r>
     </w:p>
@@ -1830,7 +1817,7 @@
           <w:rFonts w:ascii="Cambria" w:hAnsi="Cambria"/>
         </w:rPr>
         <w:pict w14:anchorId="3C2D4426">
-          <v:rect id="_x0000_i1039" style="width:0;height:1.5pt" o:hralign="center" o:hrstd="t" o:hr="t" fillcolor="#a0a0a0" stroked="f"/>
+          <v:rect id="_x0000_i1040" style="width:0;height:1.5pt" o:hralign="center" o:hrstd="t" o:hr="t" fillcolor="#a0a0a0" stroked="f"/>
         </w:pict>
       </w:r>
     </w:p>
@@ -1869,7 +1856,6 @@
         </w:rPr>
         <w:br/>
       </w:r>
-      <w:proofErr w:type="spellStart"/>
       <m:oMathPara>
         <m:oMath>
           <m:r>
@@ -1883,7 +1869,6 @@
           </m:r>
         </m:oMath>
       </m:oMathPara>
-      <w:proofErr w:type="spellEnd"/>
     </w:p>
     <w:p>
       <w:pPr>
@@ -1909,21 +1894,7 @@
         <w:rPr>
           <w:rFonts w:ascii="Cambria" w:hAnsi="Cambria"/>
         </w:rPr>
-        <w:t xml:space="preserve">Higher </w:t>
-      </w:r>
-      <w:proofErr w:type="spellStart"/>
-      <w:r>
-        <w:rPr>
-          <w:rFonts w:ascii="Cambria" w:hAnsi="Cambria"/>
-        </w:rPr>
-        <w:t>circR</w:t>
-      </w:r>
-      <w:proofErr w:type="spellEnd"/>
-      <w:r>
-        <w:rPr>
-          <w:rFonts w:ascii="Cambria" w:hAnsi="Cambria"/>
-        </w:rPr>
-        <w:t xml:space="preserve"> values indicate stronger phase-aligned coordination under preserved pairing conditions. Observable magnitude alone, however, is insufficient for structural acceptance.</w:t>
+        <w:t>Higher circR values indicate stronger phase-aligned coordination under preserved pairing conditions. Observable magnitude alone, however, is insufficient for structural acceptance.</w:t>
       </w:r>
     </w:p>
     <w:p>
@@ -1937,7 +1908,7 @@
           <w:rFonts w:ascii="Cambria" w:hAnsi="Cambria"/>
         </w:rPr>
         <w:pict w14:anchorId="2F9C37C7">
-          <v:rect id="_x0000_i1040" style="width:0;height:1.5pt" o:hralign="center" o:hrstd="t" o:hr="t" fillcolor="#a0a0a0" stroked="f"/>
+          <v:rect id="_x0000_i1041" style="width:0;height:1.5pt" o:hralign="center" o:hrstd="t" o:hr="t" fillcolor="#a0a0a0" stroked="f"/>
         </w:pict>
       </w:r>
     </w:p>
@@ -2192,7 +2163,7 @@
           <w:rFonts w:ascii="Cambria" w:hAnsi="Cambria"/>
         </w:rPr>
         <w:pict w14:anchorId="17149C32">
-          <v:rect id="_x0000_i1041" style="width:0;height:1.5pt" o:hralign="center" o:hrstd="t" o:hr="t" fillcolor="#a0a0a0" stroked="f"/>
+          <v:rect id="_x0000_i1042" style="width:0;height:1.5pt" o:hralign="center" o:hrstd="t" o:hr="t" fillcolor="#a0a0a0" stroked="f"/>
         </w:pict>
       </w:r>
     </w:p>
@@ -2314,7 +2285,7 @@
           <w:rFonts w:ascii="Cambria" w:hAnsi="Cambria"/>
         </w:rPr>
         <w:pict w14:anchorId="0CB8E7E9">
-          <v:rect id="_x0000_i1042" style="width:0;height:1.5pt" o:hralign="center" o:hrstd="t" o:hr="t" fillcolor="#a0a0a0" stroked="f"/>
+          <v:rect id="_x0000_i1043" style="width:0;height:1.5pt" o:hralign="center" o:hrstd="t" o:hr="t" fillcolor="#a0a0a0" stroked="f"/>
         </w:pict>
       </w:r>
     </w:p>
@@ -2475,7 +2446,7 @@
           <w:rFonts w:ascii="Cambria" w:hAnsi="Cambria"/>
         </w:rPr>
         <w:pict w14:anchorId="2CA57C89">
-          <v:rect id="_x0000_i1043" style="width:0;height:1.5pt" o:hralign="center" o:hrstd="t" o:hr="t" fillcolor="#a0a0a0" stroked="f"/>
+          <v:rect id="_x0000_i1044" style="width:0;height:1.5pt" o:hralign="center" o:hrstd="t" o:hr="t" fillcolor="#a0a0a0" stroked="f"/>
         </w:pict>
       </w:r>
     </w:p>
@@ -2680,7 +2651,7 @@
           <w:rFonts w:ascii="Cambria" w:hAnsi="Cambria"/>
         </w:rPr>
         <w:pict w14:anchorId="63A751A9">
-          <v:rect id="_x0000_i1044" style="width:0;height:1.5pt" o:hralign="center" o:hrstd="t" o:hr="t" fillcolor="#a0a0a0" stroked="f"/>
+          <v:rect id="_x0000_i1045" style="width:0;height:1.5pt" o:hralign="center" o:hrstd="t" o:hr="t" fillcolor="#a0a0a0" stroked="f"/>
         </w:pict>
       </w:r>
     </w:p>
@@ -2725,7 +2696,7 @@
           <w:rFonts w:ascii="Cambria" w:hAnsi="Cambria"/>
         </w:rPr>
         <w:pict w14:anchorId="24F49B96">
-          <v:rect id="_x0000_i1045" style="width:0;height:1.5pt" o:hralign="center" o:hrstd="t" o:hr="t" fillcolor="#a0a0a0" stroked="f"/>
+          <v:rect id="_x0000_i1046" style="width:0;height:1.5pt" o:hralign="center" o:hrstd="t" o:hr="t" fillcolor="#a0a0a0" stroked="f"/>
         </w:pict>
       </w:r>
     </w:p>
@@ -2886,7 +2857,7 @@
           <w:rFonts w:ascii="Cambria" w:hAnsi="Cambria"/>
         </w:rPr>
         <w:pict w14:anchorId="57017F24">
-          <v:rect id="_x0000_i1046" style="width:0;height:1.5pt" o:hralign="center" o:hrstd="t" o:hr="t" fillcolor="#a0a0a0" stroked="f"/>
+          <v:rect id="_x0000_i1047" style="width:0;height:1.5pt" o:hralign="center" o:hrstd="t" o:hr="t" fillcolor="#a0a0a0" stroked="f"/>
         </w:pict>
       </w:r>
     </w:p>
@@ -3367,7 +3338,7 @@
           <w:rFonts w:ascii="Cambria" w:hAnsi="Cambria"/>
         </w:rPr>
         <w:pict w14:anchorId="6F776403">
-          <v:rect id="_x0000_i1047" style="width:0;height:1.5pt" o:hralign="center" o:hrstd="t" o:hr="t" fillcolor="#a0a0a0" stroked="f"/>
+          <v:rect id="_x0000_i1048" style="width:0;height:1.5pt" o:hralign="center" o:hrstd="t" o:hr="t" fillcolor="#a0a0a0" stroked="f"/>
         </w:pict>
       </w:r>
     </w:p>
@@ -3411,7 +3382,6 @@
           <w:rFonts w:ascii="Cambria" w:hAnsi="Cambria"/>
         </w:rPr>
       </w:pPr>
-      <w:proofErr w:type="spellStart"/>
       <w:r>
         <w:rPr>
           <w:rFonts w:ascii="Cambria" w:hAnsi="Cambria"/>
@@ -3420,7 +3390,6 @@
         </w:rPr>
         <w:t>gauss_zero</w:t>
       </w:r>
-      <w:proofErr w:type="spellEnd"/>
       <w:r>
         <w:rPr>
           <w:rFonts w:ascii="Cambria" w:hAnsi="Cambria"/>
@@ -3439,7 +3408,6 @@
           <w:rFonts w:ascii="Cambria" w:hAnsi="Cambria"/>
         </w:rPr>
       </w:pPr>
-      <w:proofErr w:type="spellStart"/>
       <w:r>
         <w:rPr>
           <w:rFonts w:ascii="Cambria" w:hAnsi="Cambria"/>
@@ -3448,27 +3416,12 @@
         </w:rPr>
         <w:t>em_swap</w:t>
       </w:r>
-      <w:proofErr w:type="spellEnd"/>
       <w:r>
         <w:rPr>
           <w:rFonts w:ascii="Cambria" w:hAnsi="Cambria"/>
         </w:rPr>
         <w:br/>
-        <w:t>disrupts the internal pairing structure through exchange of the ((U_</w:t>
-      </w:r>
-      <w:proofErr w:type="gramStart"/>
-      <w:r>
-        <w:rPr>
-          <w:rFonts w:ascii="Cambria" w:hAnsi="Cambria"/>
-        </w:rPr>
-        <w:t>E,U</w:t>
-      </w:r>
-      <w:proofErr w:type="gramEnd"/>
-      <w:r>
-        <w:rPr>
-          <w:rFonts w:ascii="Cambria" w:hAnsi="Cambria"/>
-        </w:rPr>
-        <w:t>_M)) representation.</w:t>
+        <w:t>disrupts the internal pairing structure through exchange of the ((U_E,U_M)) representation.</w:t>
       </w:r>
     </w:p>
     <w:p>
@@ -3495,7 +3448,7 @@
           <w:rFonts w:ascii="Cambria" w:hAnsi="Cambria"/>
         </w:rPr>
         <w:pict w14:anchorId="5244C26C">
-          <v:rect id="_x0000_i1048" style="width:0;height:1.5pt" o:hralign="center" o:hrstd="t" o:hr="t" fillcolor="#a0a0a0" stroked="f"/>
+          <v:rect id="_x0000_i1049" style="width:0;height:1.5pt" o:hralign="center" o:hrstd="t" o:hr="t" fillcolor="#a0a0a0" stroked="f"/>
         </w:pict>
       </w:r>
     </w:p>
@@ -3704,19 +3657,11 @@
           <w:rFonts w:ascii="Cambria" w:hAnsi="Cambria"/>
         </w:rPr>
       </w:pPr>
-      <w:proofErr w:type="spellStart"/>
-      <w:r>
-        <w:rPr>
-          <w:rFonts w:ascii="Cambria" w:hAnsi="Cambria"/>
-        </w:rPr>
-        <w:t>gauss_zero</w:t>
-      </w:r>
-      <w:proofErr w:type="spellEnd"/>
-      <w:r>
-        <w:rPr>
-          <w:rFonts w:ascii="Cambria" w:hAnsi="Cambria"/>
-        </w:rPr>
-        <w:t>,</w:t>
+      <w:r>
+        <w:rPr>
+          <w:rFonts w:ascii="Cambria" w:hAnsi="Cambria"/>
+        </w:rPr>
+        <w:t>gauss_zero,</w:t>
       </w:r>
     </w:p>
     <w:p>
@@ -3733,21 +3678,7 @@
         <w:rPr>
           <w:rFonts w:ascii="Cambria" w:hAnsi="Cambria"/>
         </w:rPr>
-        <w:t xml:space="preserve">and </w:t>
-      </w:r>
-      <w:proofErr w:type="spellStart"/>
-      <w:r>
-        <w:rPr>
-          <w:rFonts w:ascii="Cambria" w:hAnsi="Cambria"/>
-        </w:rPr>
-        <w:t>em_swap</w:t>
-      </w:r>
-      <w:proofErr w:type="spellEnd"/>
-      <w:r>
-        <w:rPr>
-          <w:rFonts w:ascii="Cambria" w:hAnsi="Cambria"/>
-        </w:rPr>
-        <w:t>.</w:t>
+        <w:t>and em_swap.</w:t>
       </w:r>
     </w:p>
     <w:p>
@@ -3774,7 +3705,7 @@
           <w:rFonts w:ascii="Cambria" w:hAnsi="Cambria"/>
         </w:rPr>
         <w:pict w14:anchorId="32E3827A">
-          <v:rect id="_x0000_i1049" style="width:0;height:1.5pt" o:hralign="center" o:hrstd="t" o:hr="t" fillcolor="#a0a0a0" stroked="f"/>
+          <v:rect id="_x0000_i1050" style="width:0;height:1.5pt" o:hralign="center" o:hrstd="t" o:hr="t" fillcolor="#a0a0a0" stroked="f"/>
         </w:pict>
       </w:r>
     </w:p>
@@ -3934,7 +3865,7 @@
           <w:rFonts w:ascii="Cambria" w:hAnsi="Cambria"/>
         </w:rPr>
         <w:pict w14:anchorId="5D11429B">
-          <v:rect id="_x0000_i1050" style="width:0;height:1.5pt" o:hralign="center" o:hrstd="t" o:hr="t" fillcolor="#a0a0a0" stroked="f"/>
+          <v:rect id="_x0000_i1051" style="width:0;height:1.5pt" o:hralign="center" o:hrstd="t" o:hr="t" fillcolor="#a0a0a0" stroked="f"/>
         </w:pict>
       </w:r>
     </w:p>
@@ -3978,7 +3909,6 @@
           <w:rFonts w:ascii="Cambria" w:hAnsi="Cambria"/>
         </w:rPr>
       </w:pPr>
-      <w:proofErr w:type="spellStart"/>
       <w:r>
         <w:rPr>
           <w:rFonts w:ascii="Cambria" w:hAnsi="Cambria"/>
@@ -3987,7 +3917,6 @@
         </w:rPr>
         <w:t>PASS_directional_controls</w:t>
       </w:r>
-      <w:proofErr w:type="spellEnd"/>
       <w:r>
         <w:rPr>
           <w:rFonts w:ascii="Cambria" w:hAnsi="Cambria"/>
@@ -4141,7 +4070,7 @@
           <w:rFonts w:ascii="Cambria" w:hAnsi="Cambria"/>
         </w:rPr>
         <w:pict w14:anchorId="0D1EA918">
-          <v:rect id="_x0000_i1051" style="width:0;height:1.5pt" o:hralign="center" o:hrstd="t" o:hr="t" fillcolor="#a0a0a0" stroked="f"/>
+          <v:rect id="_x0000_i1052" style="width:0;height:1.5pt" o:hralign="center" o:hrstd="t" o:hr="t" fillcolor="#a0a0a0" stroked="f"/>
         </w:pict>
       </w:r>
     </w:p>
@@ -4186,7 +4115,7 @@
           <w:rFonts w:ascii="Cambria" w:hAnsi="Cambria"/>
         </w:rPr>
         <w:pict w14:anchorId="1F9B45DA">
-          <v:rect id="_x0000_i1052" style="width:0;height:1.5pt" o:hralign="center" o:hrstd="t" o:hr="t" fillcolor="#a0a0a0" stroked="f"/>
+          <v:rect id="_x0000_i1053" style="width:0;height:1.5pt" o:hralign="center" o:hrstd="t" o:hr="t" fillcolor="#a0a0a0" stroked="f"/>
         </w:pict>
       </w:r>
     </w:p>
@@ -4312,7 +4241,7 @@
           <w:rFonts w:ascii="Cambria" w:hAnsi="Cambria"/>
         </w:rPr>
         <w:pict w14:anchorId="22D38B52">
-          <v:rect id="_x0000_i1053" style="width:0;height:1.5pt" o:hralign="center" o:hrstd="t" o:hr="t" fillcolor="#a0a0a0" stroked="f"/>
+          <v:rect id="_x0000_i1054" style="width:0;height:1.5pt" o:hralign="center" o:hrstd="t" o:hr="t" fillcolor="#a0a0a0" stroked="f"/>
         </w:pict>
       </w:r>
     </w:p>
@@ -4507,7 +4436,7 @@
           <w:rFonts w:ascii="Cambria" w:hAnsi="Cambria"/>
         </w:rPr>
         <w:pict w14:anchorId="28949B70">
-          <v:rect id="_x0000_i1054" style="width:0;height:1.5pt" o:hralign="center" o:hrstd="t" o:hr="t" fillcolor="#a0a0a0" stroked="f"/>
+          <v:rect id="_x0000_i1055" style="width:0;height:1.5pt" o:hralign="center" o:hrstd="t" o:hr="t" fillcolor="#a0a0a0" stroked="f"/>
         </w:pict>
       </w:r>
     </w:p>
@@ -4615,19 +4544,11 @@
           <w:rFonts w:ascii="Cambria" w:hAnsi="Cambria"/>
         </w:rPr>
       </w:pPr>
-      <w:proofErr w:type="spellStart"/>
-      <w:r>
-        <w:rPr>
-          <w:rFonts w:ascii="Cambria" w:hAnsi="Cambria"/>
-        </w:rPr>
-        <w:t>gauss_zero</w:t>
-      </w:r>
-      <w:proofErr w:type="spellEnd"/>
-      <w:r>
-        <w:rPr>
-          <w:rFonts w:ascii="Cambria" w:hAnsi="Cambria"/>
-        </w:rPr>
-        <w:t xml:space="preserve"> perturbations,</w:t>
+      <w:r>
+        <w:rPr>
+          <w:rFonts w:ascii="Cambria" w:hAnsi="Cambria"/>
+        </w:rPr>
+        <w:t>gauss_zero perturbations,</w:t>
       </w:r>
     </w:p>
     <w:p>
@@ -4644,21 +4565,7 @@
         <w:rPr>
           <w:rFonts w:ascii="Cambria" w:hAnsi="Cambria"/>
         </w:rPr>
-        <w:t xml:space="preserve">and </w:t>
-      </w:r>
-      <w:proofErr w:type="spellStart"/>
-      <w:r>
-        <w:rPr>
-          <w:rFonts w:ascii="Cambria" w:hAnsi="Cambria"/>
-        </w:rPr>
-        <w:t>em_swap</w:t>
-      </w:r>
-      <w:proofErr w:type="spellEnd"/>
-      <w:r>
-        <w:rPr>
-          <w:rFonts w:ascii="Cambria" w:hAnsi="Cambria"/>
-        </w:rPr>
-        <w:t xml:space="preserve"> controls.</w:t>
+        <w:t>and em_swap controls.</w:t>
       </w:r>
     </w:p>
     <w:p>
@@ -4685,7 +4592,7 @@
           <w:rFonts w:ascii="Cambria" w:hAnsi="Cambria"/>
         </w:rPr>
         <w:pict w14:anchorId="681BD893">
-          <v:rect id="_x0000_i1055" style="width:0;height:1.5pt" o:hralign="center" o:hrstd="t" o:hr="t" fillcolor="#a0a0a0" stroked="f"/>
+          <v:rect id="_x0000_i1056" style="width:0;height:1.5pt" o:hralign="center" o:hrstd="t" o:hr="t" fillcolor="#a0a0a0" stroked="f"/>
         </w:pict>
       </w:r>
     </w:p>
@@ -4892,7 +4799,7 @@
           <w:rFonts w:ascii="Cambria" w:hAnsi="Cambria"/>
         </w:rPr>
         <w:pict w14:anchorId="0F5064C9">
-          <v:rect id="_x0000_i1056" style="width:0;height:1.5pt" o:hralign="center" o:hrstd="t" o:hr="t" fillcolor="#a0a0a0" stroked="f"/>
+          <v:rect id="_x0000_i1057" style="width:0;height:1.5pt" o:hralign="center" o:hrstd="t" o:hr="t" fillcolor="#a0a0a0" stroked="f"/>
         </w:pict>
       </w:r>
     </w:p>
@@ -5015,7 +4922,7 @@
           <w:rFonts w:ascii="Cambria" w:hAnsi="Cambria"/>
         </w:rPr>
         <w:pict w14:anchorId="1A371D48">
-          <v:rect id="_x0000_i1057" style="width:0;height:1.5pt" o:hralign="center" o:hrstd="t" o:hr="t" fillcolor="#a0a0a0" stroked="f"/>
+          <v:rect id="_x0000_i1058" style="width:0;height:1.5pt" o:hralign="center" o:hrstd="t" o:hr="t" fillcolor="#a0a0a0" stroked="f"/>
         </w:pict>
       </w:r>
     </w:p>
@@ -5154,7 +5061,7 @@
           <w:rFonts w:ascii="Cambria" w:hAnsi="Cambria"/>
         </w:rPr>
         <w:pict w14:anchorId="4F6B17B7">
-          <v:rect id="_x0000_i1058" style="width:0;height:1.5pt" o:hralign="center" o:hrstd="t" o:hr="t" fillcolor="#a0a0a0" stroked="f"/>
+          <v:rect id="_x0000_i1059" style="width:0;height:1.5pt" o:hralign="center" o:hrstd="t" o:hr="t" fillcolor="#a0a0a0" stroked="f"/>
         </w:pict>
       </w:r>
     </w:p>
@@ -5623,14 +5530,12 @@
                 <w:rFonts w:ascii="Cambria" w:hAnsi="Cambria"/>
               </w:rPr>
             </w:pPr>
-            <w:proofErr w:type="spellStart"/>
             <w:r>
               <w:rPr>
                 <w:rFonts w:ascii="Cambria" w:hAnsi="Cambria"/>
               </w:rPr>
               <w:t>circR</w:t>
             </w:r>
-            <w:proofErr w:type="spellEnd"/>
           </w:p>
         </w:tc>
         <w:tc>
@@ -5731,21 +5636,7 @@
               <w:rPr>
                 <w:rFonts w:ascii="Cambria" w:hAnsi="Cambria"/>
               </w:rPr>
-              <w:t>paired ((U_</w:t>
-            </w:r>
-            <w:proofErr w:type="gramStart"/>
-            <w:r>
-              <w:rPr>
-                <w:rFonts w:ascii="Cambria" w:hAnsi="Cambria"/>
-              </w:rPr>
-              <w:t>E,U</w:t>
-            </w:r>
-            <w:proofErr w:type="gramEnd"/>
-            <w:r>
-              <w:rPr>
-                <w:rFonts w:ascii="Cambria" w:hAnsi="Cambria"/>
-              </w:rPr>
-              <w:t>_M)) representation</w:t>
+              <w:t>paired ((U_E,U_M)) representation</w:t>
             </w:r>
           </w:p>
         </w:tc>
@@ -5765,21 +5656,7 @@
               <w:rPr>
                 <w:rFonts w:ascii="Cambria" w:hAnsi="Cambria"/>
               </w:rPr>
-              <w:t>(C_4), abs_(C_</w:t>
-            </w:r>
-            <w:proofErr w:type="gramStart"/>
-            <w:r>
-              <w:rPr>
-                <w:rFonts w:ascii="Cambria" w:hAnsi="Cambria"/>
-              </w:rPr>
-              <w:t>4)_</w:t>
-            </w:r>
-            <w:proofErr w:type="gramEnd"/>
-            <w:r>
-              <w:rPr>
-                <w:rFonts w:ascii="Cambria" w:hAnsi="Cambria"/>
-              </w:rPr>
-              <w:t>median</w:t>
+              <w:t>(C_4), abs_(C_4)_median</w:t>
             </w:r>
           </w:p>
         </w:tc>
@@ -5795,28 +5672,12 @@
                 <w:rFonts w:ascii="Cambria" w:hAnsi="Cambria"/>
               </w:rPr>
             </w:pPr>
-            <w:proofErr w:type="spellStart"/>
             <w:r>
               <w:rPr>
                 <w:rFonts w:ascii="Cambria" w:hAnsi="Cambria"/>
               </w:rPr>
-              <w:t>gauss_zero</w:t>
+              <w:t>gauss_zero, em_swap</w:t>
             </w:r>
-            <w:proofErr w:type="spellEnd"/>
-            <w:r>
-              <w:rPr>
-                <w:rFonts w:ascii="Cambria" w:hAnsi="Cambria"/>
-              </w:rPr>
-              <w:t xml:space="preserve">, </w:t>
-            </w:r>
-            <w:proofErr w:type="spellStart"/>
-            <w:r>
-              <w:rPr>
-                <w:rFonts w:ascii="Cambria" w:hAnsi="Cambria"/>
-              </w:rPr>
-              <w:t>em_swap</w:t>
-            </w:r>
-            <w:proofErr w:type="spellEnd"/>
           </w:p>
         </w:tc>
         <w:tc>
@@ -5851,19 +5712,11 @@
                 <w:rFonts w:ascii="Cambria" w:hAnsi="Cambria"/>
               </w:rPr>
             </w:pPr>
-            <w:proofErr w:type="spellStart"/>
             <w:r>
               <w:rPr>
                 <w:rFonts w:ascii="Cambria" w:hAnsi="Cambria"/>
               </w:rPr>
-              <w:t>PASS_directional_controls</w:t>
-            </w:r>
-            <w:proofErr w:type="spellEnd"/>
-            <w:r>
-              <w:rPr>
-                <w:rFonts w:ascii="Cambria" w:hAnsi="Cambria"/>
-              </w:rPr>
-              <w:t xml:space="preserve"> / FAIL</w:t>
+              <w:t>PASS_directional_controls / FAIL</w:t>
             </w:r>
           </w:p>
         </w:tc>
@@ -5900,7 +5753,7 @@
           <w:rFonts w:ascii="Cambria" w:hAnsi="Cambria"/>
         </w:rPr>
         <w:pict w14:anchorId="5A79A909">
-          <v:rect id="_x0000_i1059" style="width:0;height:1.5pt" o:hralign="center" o:hrstd="t" o:hr="t" fillcolor="#a0a0a0" stroked="f"/>
+          <v:rect id="_x0000_i1060" style="width:0;height:1.5pt" o:hralign="center" o:hrstd="t" o:hr="t" fillcolor="#a0a0a0" stroked="f"/>
         </w:pict>
       </w:r>
     </w:p>
@@ -6027,7 +5880,7 @@
         </w:rPr>
         <w:lastRenderedPageBreak/>
         <w:pict w14:anchorId="0DB1AFBF">
-          <v:rect id="_x0000_i1060" style="width:0;height:1.5pt" o:hralign="center" o:hrstd="t" o:hr="t" fillcolor="#a0a0a0" stroked="f"/>
+          <v:rect id="_x0000_i1061" style="width:0;height:1.5pt" o:hralign="center" o:hrstd="t" o:hr="t" fillcolor="#a0a0a0" stroked="f"/>
         </w:pict>
       </w:r>
     </w:p>
@@ -6042,7 +5895,7 @@
           <w:rFonts w:ascii="Cambria" w:hAnsi="Cambria"/>
         </w:rPr>
         <w:pict w14:anchorId="1934F66E">
-          <v:rect id="_x0000_i1061" style="width:0;height:1.5pt" o:hralign="center" o:bullet="t" o:hrstd="t" o:hr="t" fillcolor="#a0a0a0" stroked="f"/>
+          <v:rect id="_x0000_i1062" style="width:0;height:1.5pt" o:hralign="center" o:bullet="t" o:hrstd="t" o:hr="t" fillcolor="#a0a0a0" stroked="f"/>
         </w:pict>
       </w:r>
     </w:p>
@@ -6072,7 +5925,7 @@
           <w:rFonts w:ascii="Cambria" w:hAnsi="Cambria"/>
         </w:rPr>
         <w:pict w14:anchorId="38E0064B">
-          <v:rect id="_x0000_i1062" style="width:0;height:1.5pt" o:hralign="center" o:hrstd="t" o:hr="t" fillcolor="#a0a0a0" stroked="f"/>
+          <v:rect id="_x0000_i1063" style="width:0;height:1.5pt" o:hralign="center" o:hrstd="t" o:hr="t" fillcolor="#a0a0a0" stroked="f"/>
         </w:pict>
       </w:r>
     </w:p>
@@ -6143,7 +5996,7 @@
           <w:rFonts w:ascii="Cambria" w:hAnsi="Cambria"/>
         </w:rPr>
         <w:pict w14:anchorId="5A6BBA6B">
-          <v:rect id="_x0000_i1063" style="width:0;height:1.5pt" o:hralign="center" o:hrstd="t" o:hr="t" fillcolor="#a0a0a0" stroked="f"/>
+          <v:rect id="_x0000_i1064" style="width:0;height:1.5pt" o:hralign="center" o:hrstd="t" o:hr="t" fillcolor="#a0a0a0" stroked="f"/>
         </w:pict>
       </w:r>
     </w:p>
@@ -6299,7 +6152,7 @@
           <w:rFonts w:ascii="Cambria" w:hAnsi="Cambria"/>
         </w:rPr>
         <w:pict w14:anchorId="71DB7AC7">
-          <v:rect id="_x0000_i1064" style="width:0;height:1.5pt" o:hralign="center" o:hrstd="t" o:hr="t" fillcolor="#a0a0a0" stroked="f"/>
+          <v:rect id="_x0000_i1065" style="width:0;height:1.5pt" o:hralign="center" o:hrstd="t" o:hr="t" fillcolor="#a0a0a0" stroked="f"/>
         </w:pict>
       </w:r>
     </w:p>
@@ -6340,21 +6193,7 @@
         <w:rPr>
           <w:rFonts w:ascii="Cambria" w:hAnsi="Cambria"/>
         </w:rPr>
-        <w:t xml:space="preserve">The complete set of </w:t>
-      </w:r>
-      <w:proofErr w:type="gramStart"/>
-      <w:r>
-        <w:rPr>
-          <w:rFonts w:ascii="Cambria" w:hAnsi="Cambria"/>
-        </w:rPr>
-        <w:t>n</w:t>
-      </w:r>
-      <w:proofErr w:type="gramEnd"/>
-      <w:r>
-        <w:rPr>
-          <w:rFonts w:ascii="Cambria" w:hAnsi="Cambria"/>
-        </w:rPr>
-        <w:t>₁ outcomes is reported for the gamma-ray burst (GRB) evaluation under the required surrogate null comparisons. The detector evaluates directional time-order asymmetry using the frozen directional statistic under phase-randomized and block-shuffle falsification conditions.</w:t>
+        <w:t>The complete set of n₁ outcomes is reported for the gamma-ray burst (GRB) evaluation under the required surrogate null comparisons. The detector evaluates directional time-order asymmetry using the frozen directional statistic under phase-randomized and block-shuffle falsification conditions.</w:t>
       </w:r>
     </w:p>
     <w:p>
@@ -6451,23 +6290,13 @@
                 <w:bCs/>
               </w:rPr>
             </w:pPr>
-            <w:proofErr w:type="spellStart"/>
             <w:r>
               <w:rPr>
                 <w:rFonts w:ascii="Cambria" w:hAnsi="Cambria"/>
                 <w:b/>
                 <w:bCs/>
               </w:rPr>
-              <w:t>kψ</w:t>
-            </w:r>
-            <w:proofErr w:type="spellEnd"/>
-            <w:r>
-              <w:rPr>
-                <w:rFonts w:ascii="Cambria" w:hAnsi="Cambria"/>
-                <w:b/>
-                <w:bCs/>
-              </w:rPr>
-              <w:t xml:space="preserve"> (real)</w:t>
+              <w:t>kψ (real)</w:t>
             </w:r>
           </w:p>
         </w:tc>
@@ -6486,23 +6315,13 @@
                 <w:bCs/>
               </w:rPr>
             </w:pPr>
-            <w:proofErr w:type="spellStart"/>
             <w:r>
               <w:rPr>
                 <w:rFonts w:ascii="Cambria" w:hAnsi="Cambria"/>
                 <w:b/>
                 <w:bCs/>
               </w:rPr>
-              <w:t>kψ</w:t>
-            </w:r>
-            <w:proofErr w:type="spellEnd"/>
-            <w:r>
-              <w:rPr>
-                <w:rFonts w:ascii="Cambria" w:hAnsi="Cambria"/>
-                <w:b/>
-                <w:bCs/>
-              </w:rPr>
-              <w:t xml:space="preserve"> (phase null)</w:t>
+              <w:t>kψ (phase null)</w:t>
             </w:r>
           </w:p>
         </w:tc>
@@ -6521,23 +6340,13 @@
                 <w:bCs/>
               </w:rPr>
             </w:pPr>
-            <w:proofErr w:type="spellStart"/>
             <w:r>
               <w:rPr>
                 <w:rFonts w:ascii="Cambria" w:hAnsi="Cambria"/>
                 <w:b/>
                 <w:bCs/>
               </w:rPr>
-              <w:t>kψ</w:t>
-            </w:r>
-            <w:proofErr w:type="spellEnd"/>
-            <w:r>
-              <w:rPr>
-                <w:rFonts w:ascii="Cambria" w:hAnsi="Cambria"/>
-                <w:b/>
-                <w:bCs/>
-              </w:rPr>
-              <w:t xml:space="preserve"> (block null)</w:t>
+              <w:t>kψ (block null)</w:t>
             </w:r>
           </w:p>
         </w:tc>
@@ -6556,7 +6365,6 @@
                 <w:bCs/>
               </w:rPr>
             </w:pPr>
-            <w:proofErr w:type="spellStart"/>
             <w:r>
               <w:rPr>
                 <w:rFonts w:ascii="Cambria" w:hAnsi="Cambria"/>
@@ -6565,7 +6373,6 @@
               </w:rPr>
               <w:t>p_phase</w:t>
             </w:r>
-            <w:proofErr w:type="spellEnd"/>
           </w:p>
         </w:tc>
         <w:tc>
@@ -6583,7 +6390,6 @@
                 <w:bCs/>
               </w:rPr>
             </w:pPr>
-            <w:proofErr w:type="spellStart"/>
             <w:r>
               <w:rPr>
                 <w:rFonts w:ascii="Cambria" w:hAnsi="Cambria"/>
@@ -6592,7 +6398,6 @@
               </w:rPr>
               <w:t>p_block</w:t>
             </w:r>
-            <w:proofErr w:type="spellEnd"/>
           </w:p>
         </w:tc>
         <w:tc>
@@ -6795,7 +6600,7 @@
           <w:rFonts w:ascii="Cambria" w:hAnsi="Cambria"/>
         </w:rPr>
         <w:pict w14:anchorId="0C021151">
-          <v:rect id="_x0000_i1065" style="width:0;height:1.5pt" o:hralign="center" o:hrstd="t" o:hr="t" fillcolor="#a0a0a0" stroked="f"/>
+          <v:rect id="_x0000_i1066" style="width:0;height:1.5pt" o:hralign="center" o:hrstd="t" o:hr="t" fillcolor="#a0a0a0" stroked="f"/>
         </w:pict>
       </w:r>
     </w:p>
@@ -6826,35 +6631,7 @@
         <w:rPr>
           <w:rFonts w:ascii="Cambria" w:hAnsi="Cambria"/>
         </w:rPr>
-        <w:t xml:space="preserve">The complete set of </w:t>
-      </w:r>
-      <w:proofErr w:type="gramStart"/>
-      <w:r>
-        <w:rPr>
-          <w:rFonts w:ascii="Cambria" w:hAnsi="Cambria"/>
-        </w:rPr>
-        <w:t>n</w:t>
-      </w:r>
-      <w:proofErr w:type="gramEnd"/>
-      <w:r>
-        <w:rPr>
-          <w:rFonts w:ascii="Cambria" w:hAnsi="Cambria"/>
-        </w:rPr>
-        <w:t xml:space="preserve">₂ evaluations is reported across both core GOES datasets and additional cross-domain systems. The detector evaluates alignment-dependent coordination using the </w:t>
-      </w:r>
-      <w:proofErr w:type="spellStart"/>
-      <w:r>
-        <w:rPr>
-          <w:rFonts w:ascii="Cambria" w:hAnsi="Cambria"/>
-        </w:rPr>
-        <w:t>circR</w:t>
-      </w:r>
-      <w:proofErr w:type="spellEnd"/>
-      <w:r>
-        <w:rPr>
-          <w:rFonts w:ascii="Cambria" w:hAnsi="Cambria"/>
-        </w:rPr>
-        <w:t xml:space="preserve"> observable under mismatch-based falsification. Interaction is accepted only when coordination collapses under mismatch pairing and is not preserved under surrogate nulls.</w:t>
+        <w:t>The complete set of n₂ evaluations is reported across both core GOES datasets and additional cross-domain systems. The detector evaluates alignment-dependent coordination using the circR observable under mismatch-based falsification. Interaction is accepted only when coordination collapses under mismatch pairing and is not preserved under surrogate nulls.</w:t>
       </w:r>
     </w:p>
     <w:p>
@@ -6881,7 +6658,7 @@
           <w:rFonts w:ascii="Cambria" w:hAnsi="Cambria"/>
         </w:rPr>
         <w:pict w14:anchorId="465F0EFE">
-          <v:rect id="_x0000_i1066" style="width:0;height:1.5pt" o:hralign="center" o:hrstd="t" o:hr="t" fillcolor="#a0a0a0" stroked="f"/>
+          <v:rect id="_x0000_i1067" style="width:0;height:1.5pt" o:hralign="center" o:hrstd="t" o:hr="t" fillcolor="#a0a0a0" stroked="f"/>
         </w:pict>
       </w:r>
     </w:p>
@@ -7021,23 +6798,13 @@
                 <w:bCs/>
               </w:rPr>
             </w:pPr>
-            <w:proofErr w:type="spellStart"/>
             <w:r>
               <w:rPr>
                 <w:rFonts w:ascii="Cambria" w:hAnsi="Cambria"/>
                 <w:b/>
                 <w:bCs/>
               </w:rPr>
-              <w:t>circR</w:t>
-            </w:r>
-            <w:proofErr w:type="spellEnd"/>
-            <w:r>
-              <w:rPr>
-                <w:rFonts w:ascii="Cambria" w:hAnsi="Cambria"/>
-                <w:b/>
-                <w:bCs/>
-              </w:rPr>
-              <w:t xml:space="preserve"> (aligned)</w:t>
+              <w:t>circR (aligned)</w:t>
             </w:r>
           </w:p>
         </w:tc>
@@ -7056,23 +6823,13 @@
                 <w:bCs/>
               </w:rPr>
             </w:pPr>
-            <w:proofErr w:type="spellStart"/>
             <w:r>
               <w:rPr>
                 <w:rFonts w:ascii="Cambria" w:hAnsi="Cambria"/>
                 <w:b/>
                 <w:bCs/>
               </w:rPr>
-              <w:t>circR</w:t>
-            </w:r>
-            <w:proofErr w:type="spellEnd"/>
-            <w:r>
-              <w:rPr>
-                <w:rFonts w:ascii="Cambria" w:hAnsi="Cambria"/>
-                <w:b/>
-                <w:bCs/>
-              </w:rPr>
-              <w:t xml:space="preserve"> (mismatch)</w:t>
+              <w:t>circR (mismatch)</w:t>
             </w:r>
           </w:p>
         </w:tc>
@@ -7091,23 +6848,13 @@
                 <w:bCs/>
               </w:rPr>
             </w:pPr>
-            <w:proofErr w:type="spellStart"/>
             <w:r>
               <w:rPr>
                 <w:rFonts w:ascii="Cambria" w:hAnsi="Cambria"/>
                 <w:b/>
                 <w:bCs/>
               </w:rPr>
-              <w:t>circR</w:t>
-            </w:r>
-            <w:proofErr w:type="spellEnd"/>
-            <w:r>
-              <w:rPr>
-                <w:rFonts w:ascii="Cambria" w:hAnsi="Cambria"/>
-                <w:b/>
-                <w:bCs/>
-              </w:rPr>
-              <w:t xml:space="preserve"> (phase null)</w:t>
+              <w:t>circR (phase null)</w:t>
             </w:r>
           </w:p>
         </w:tc>
@@ -7413,7 +7160,7 @@
           <w:rFonts w:ascii="Cambria" w:hAnsi="Cambria"/>
         </w:rPr>
         <w:pict w14:anchorId="47CEF373">
-          <v:rect id="_x0000_i1067" style="width:0;height:1.5pt" o:hralign="center" o:hrstd="t" o:hr="t" fillcolor="#a0a0a0" stroked="f"/>
+          <v:rect id="_x0000_i1068" style="width:0;height:1.5pt" o:hralign="center" o:hrstd="t" o:hr="t" fillcolor="#a0a0a0" stroked="f"/>
         </w:pict>
       </w:r>
     </w:p>
@@ -7551,23 +7298,13 @@
                 <w:bCs/>
               </w:rPr>
             </w:pPr>
-            <w:proofErr w:type="spellStart"/>
             <w:r>
               <w:rPr>
                 <w:rFonts w:ascii="Cambria" w:hAnsi="Cambria"/>
                 <w:b/>
                 <w:bCs/>
               </w:rPr>
-              <w:t>circR</w:t>
-            </w:r>
-            <w:proofErr w:type="spellEnd"/>
-            <w:r>
-              <w:rPr>
-                <w:rFonts w:ascii="Cambria" w:hAnsi="Cambria"/>
-                <w:b/>
-                <w:bCs/>
-              </w:rPr>
-              <w:t xml:space="preserve"> (aligned)</w:t>
+              <w:t>circR (aligned)</w:t>
             </w:r>
           </w:p>
         </w:tc>
@@ -7586,23 +7323,13 @@
                 <w:bCs/>
               </w:rPr>
             </w:pPr>
-            <w:proofErr w:type="spellStart"/>
             <w:r>
               <w:rPr>
                 <w:rFonts w:ascii="Cambria" w:hAnsi="Cambria"/>
                 <w:b/>
                 <w:bCs/>
               </w:rPr>
-              <w:t>circR</w:t>
-            </w:r>
-            <w:proofErr w:type="spellEnd"/>
-            <w:r>
-              <w:rPr>
-                <w:rFonts w:ascii="Cambria" w:hAnsi="Cambria"/>
-                <w:b/>
-                <w:bCs/>
-              </w:rPr>
-              <w:t xml:space="preserve"> (mismatch)</w:t>
+              <w:t>circR (mismatch)</w:t>
             </w:r>
           </w:p>
         </w:tc>
@@ -8179,16 +7906,8 @@
               <w:rPr>
                 <w:rFonts w:ascii="Cambria" w:hAnsi="Cambria"/>
               </w:rPr>
-              <w:t>F–</w:t>
+              <w:t>F–dF</w:t>
             </w:r>
-            <w:proofErr w:type="spellStart"/>
-            <w:r>
-              <w:rPr>
-                <w:rFonts w:ascii="Cambria" w:hAnsi="Cambria"/>
-              </w:rPr>
-              <w:t>dF</w:t>
-            </w:r>
-            <w:proofErr w:type="spellEnd"/>
           </w:p>
         </w:tc>
         <w:tc>
@@ -8284,7 +8003,7 @@
           <w:rFonts w:ascii="Cambria" w:hAnsi="Cambria"/>
         </w:rPr>
         <w:pict w14:anchorId="755622F4">
-          <v:rect id="_x0000_i1068" style="width:0;height:1.5pt" o:hralign="center" o:hrstd="t" o:hr="t" fillcolor="#a0a0a0" stroked="f"/>
+          <v:rect id="_x0000_i1069" style="width:0;height:1.5pt" o:hralign="center" o:hrstd="t" o:hr="t" fillcolor="#a0a0a0" stroked="f"/>
         </w:pict>
       </w:r>
     </w:p>
@@ -8315,21 +8034,7 @@
         <w:rPr>
           <w:rFonts w:ascii="Cambria" w:hAnsi="Cambria"/>
         </w:rPr>
-        <w:t xml:space="preserve">The complete set of </w:t>
-      </w:r>
-      <w:proofErr w:type="gramStart"/>
-      <w:r>
-        <w:rPr>
-          <w:rFonts w:ascii="Cambria" w:hAnsi="Cambria"/>
-        </w:rPr>
-        <w:t>n</w:t>
-      </w:r>
-      <w:proofErr w:type="gramEnd"/>
-      <w:r>
-        <w:rPr>
-          <w:rFonts w:ascii="Cambria" w:hAnsi="Cambria"/>
-        </w:rPr>
-        <w:t>₄ closure evaluations is reported for all analyzed Ramsey pairings under the frozen closure contract. The detector evaluates pair-dependent structural consistency using the abs_C4_median observable under mandatory perturbation controls:</w:t>
+        <w:t>The complete set of n₄ closure evaluations is reported for all analyzed Ramsey pairings under the frozen closure contract. The detector evaluates pair-dependent structural consistency using the abs_C4_median observable under mandatory perturbation controls:</w:t>
       </w:r>
     </w:p>
     <w:p>
@@ -8342,20 +8047,12 @@
           <w:rFonts w:ascii="Cambria" w:hAnsi="Cambria"/>
         </w:rPr>
       </w:pPr>
-      <w:proofErr w:type="spellStart"/>
       <w:r>
         <w:rPr>
           <w:rFonts w:ascii="Cambria" w:hAnsi="Cambria"/>
         </w:rPr>
         <w:lastRenderedPageBreak/>
-        <w:t>gauss_zero</w:t>
-      </w:r>
-      <w:proofErr w:type="spellEnd"/>
-      <w:r>
-        <w:rPr>
-          <w:rFonts w:ascii="Cambria" w:hAnsi="Cambria"/>
-        </w:rPr>
-        <w:t>,</w:t>
+        <w:t>gauss_zero,</w:t>
       </w:r>
     </w:p>
     <w:p>
@@ -8368,19 +8065,11 @@
           <w:rFonts w:ascii="Cambria" w:hAnsi="Cambria"/>
         </w:rPr>
       </w:pPr>
-      <w:proofErr w:type="spellStart"/>
-      <w:r>
-        <w:rPr>
-          <w:rFonts w:ascii="Cambria" w:hAnsi="Cambria"/>
-        </w:rPr>
-        <w:t>em_swap</w:t>
-      </w:r>
-      <w:proofErr w:type="spellEnd"/>
-      <w:r>
-        <w:rPr>
-          <w:rFonts w:ascii="Cambria" w:hAnsi="Cambria"/>
-        </w:rPr>
-        <w:t>.</w:t>
+      <w:r>
+        <w:rPr>
+          <w:rFonts w:ascii="Cambria" w:hAnsi="Cambria"/>
+        </w:rPr>
+        <w:t>em_swap.</w:t>
       </w:r>
     </w:p>
     <w:p>
@@ -9499,7 +9188,7 @@
           <w:rFonts w:ascii="Cambria" w:hAnsi="Cambria"/>
         </w:rPr>
         <w:pict w14:anchorId="3AB7EFA7">
-          <v:rect id="_x0000_i1069" style="width:0;height:1.5pt" o:hralign="center" o:hrstd="t" o:hr="t" fillcolor="#a0a0a0" stroked="f"/>
+          <v:rect id="_x0000_i1070" style="width:0;height:1.5pt" o:hralign="center" o:hrstd="t" o:hr="t" fillcolor="#a0a0a0" stroked="f"/>
         </w:pict>
       </w:r>
     </w:p>
@@ -10124,7 +9813,7 @@
           <w:rFonts w:ascii="Cambria" w:hAnsi="Cambria"/>
         </w:rPr>
         <w:pict w14:anchorId="3D71C005">
-          <v:rect id="_x0000_i1070" style="width:0;height:1.5pt" o:hralign="center" o:hrstd="t" o:hr="t" fillcolor="#a0a0a0" stroked="f"/>
+          <v:rect id="_x0000_i1071" style="width:0;height:1.5pt" o:hralign="center" o:hrstd="t" o:hr="t" fillcolor="#a0a0a0" stroked="f"/>
         </w:pict>
       </w:r>
     </w:p>
@@ -10340,7 +10029,7 @@
           <w:rFonts w:ascii="Cambria" w:hAnsi="Cambria"/>
         </w:rPr>
         <w:pict w14:anchorId="4FE05E4D">
-          <v:rect id="_x0000_i1071" style="width:0;height:1.5pt" o:hralign="center" o:hrstd="t" o:hr="t" fillcolor="#a0a0a0" stroked="f"/>
+          <v:rect id="_x0000_i1072" style="width:0;height:1.5pt" o:hralign="center" o:hrstd="t" o:hr="t" fillcolor="#a0a0a0" stroked="f"/>
         </w:pict>
       </w:r>
     </w:p>
@@ -10374,33 +10063,15 @@
           <w:b/>
           <w:bCs/>
         </w:rPr>
-        <w:t xml:space="preserve"> </w:t>
-      </w:r>
-      <w:proofErr w:type="gramStart"/>
+        <w:t xml:space="preserve"> — </w:t>
+      </w:r>
       <w:r>
         <w:rPr>
           <w:rFonts w:ascii="Cambria" w:hAnsi="Cambria"/>
           <w:b/>
           <w:bCs/>
         </w:rPr>
-        <w:t xml:space="preserve">— </w:t>
-      </w:r>
-      <w:r>
-        <w:rPr>
-          <w:rFonts w:ascii="Cambria" w:hAnsi="Cambria"/>
-          <w:b/>
-          <w:bCs/>
-        </w:rPr>
-        <w:t xml:space="preserve"> Failure</w:t>
-      </w:r>
-      <w:proofErr w:type="gramEnd"/>
-      <w:r>
-        <w:rPr>
-          <w:rFonts w:ascii="Cambria" w:hAnsi="Cambria"/>
-          <w:b/>
-          <w:bCs/>
-        </w:rPr>
-        <w:t>-Rate Summary</w:t>
+        <w:t xml:space="preserve"> Failure-Rate Summary</w:t>
       </w:r>
     </w:p>
     <w:tbl>
@@ -10610,16 +10281,8 @@
               <w:rPr>
                 <w:rFonts w:ascii="Cambria" w:hAnsi="Cambria"/>
               </w:rPr>
-              <w:t xml:space="preserve">2 </w:t>
+              <w:t>2 FAIL</w:t>
             </w:r>
-            <w:proofErr w:type="gramStart"/>
-            <w:r>
-              <w:rPr>
-                <w:rFonts w:ascii="Cambria" w:hAnsi="Cambria"/>
-              </w:rPr>
-              <w:t>FAIL</w:t>
-            </w:r>
-            <w:proofErr w:type="gramEnd"/>
           </w:p>
         </w:tc>
       </w:tr>
@@ -10660,16 +10323,8 @@
               <w:rPr>
                 <w:rFonts w:ascii="Cambria" w:hAnsi="Cambria"/>
               </w:rPr>
-              <w:t xml:space="preserve">6 </w:t>
+              <w:t>6 PASS</w:t>
             </w:r>
-            <w:proofErr w:type="gramStart"/>
-            <w:r>
-              <w:rPr>
-                <w:rFonts w:ascii="Cambria" w:hAnsi="Cambria"/>
-              </w:rPr>
-              <w:t>PASS</w:t>
-            </w:r>
-            <w:proofErr w:type="gramEnd"/>
           </w:p>
         </w:tc>
         <w:tc>
@@ -10688,16 +10343,8 @@
               <w:rPr>
                 <w:rFonts w:ascii="Cambria" w:hAnsi="Cambria"/>
               </w:rPr>
-              <w:t xml:space="preserve">2 </w:t>
+              <w:t>2 FAIL</w:t>
             </w:r>
-            <w:proofErr w:type="gramStart"/>
-            <w:r>
-              <w:rPr>
-                <w:rFonts w:ascii="Cambria" w:hAnsi="Cambria"/>
-              </w:rPr>
-              <w:t>FAIL</w:t>
-            </w:r>
-            <w:proofErr w:type="gramEnd"/>
           </w:p>
         </w:tc>
       </w:tr>
@@ -10733,7 +10380,7 @@
           <w:rFonts w:ascii="Cambria" w:hAnsi="Cambria"/>
         </w:rPr>
         <w:pict w14:anchorId="6D8E8BAF">
-          <v:rect id="_x0000_i1072" style="width:0;height:1.5pt" o:hralign="center" o:hrstd="t" o:hr="t" fillcolor="#a0a0a0" stroked="f"/>
+          <v:rect id="_x0000_i1073" style="width:0;height:1.5pt" o:hralign="center" o:hrstd="t" o:hr="t" fillcolor="#a0a0a0" stroked="f"/>
         </w:pict>
       </w:r>
     </w:p>
@@ -10920,21 +10567,6 @@
         </w:rPr>
         <w:lastRenderedPageBreak/>
         <w:pict w14:anchorId="07BD41F0">
-          <v:rect id="_x0000_i1073" style="width:0;height:1.5pt" o:hralign="center" o:hrstd="t" o:hr="t" fillcolor="#a0a0a0" stroked="f"/>
-        </w:pict>
-      </w:r>
-    </w:p>
-    <w:p>
-      <w:pPr>
-        <w:rPr>
-          <w:rFonts w:ascii="Cambria" w:hAnsi="Cambria"/>
-        </w:rPr>
-      </w:pPr>
-      <w:r>
-        <w:rPr>
-          <w:rFonts w:ascii="Cambria" w:hAnsi="Cambria"/>
-        </w:rPr>
-        <w:pict w14:anchorId="2E9AC1A8">
           <v:rect id="_x0000_i1074" style="width:0;height:1.5pt" o:hralign="center" o:hrstd="t" o:hr="t" fillcolor="#a0a0a0" stroked="f"/>
         </w:pict>
       </w:r>
@@ -10948,6 +10580,21 @@
       <w:r>
         <w:rPr>
           <w:rFonts w:ascii="Cambria" w:hAnsi="Cambria"/>
+        </w:rPr>
+        <w:pict w14:anchorId="2E9AC1A8">
+          <v:rect id="_x0000_i1075" style="width:0;height:1.5pt" o:hralign="center" o:hrstd="t" o:hr="t" fillcolor="#a0a0a0" stroked="f"/>
+        </w:pict>
+      </w:r>
+    </w:p>
+    <w:p>
+      <w:pPr>
+        <w:rPr>
+          <w:rFonts w:ascii="Cambria" w:hAnsi="Cambria"/>
+        </w:rPr>
+      </w:pPr>
+      <w:r>
+        <w:rPr>
+          <w:rFonts w:ascii="Cambria" w:hAnsi="Cambria"/>
           <w:b/>
           <w:bCs/>
         </w:rPr>
@@ -10965,7 +10612,7 @@
           <w:rFonts w:ascii="Cambria" w:hAnsi="Cambria"/>
         </w:rPr>
         <w:pict w14:anchorId="2E734AFD">
-          <v:rect id="_x0000_i1075" style="width:0;height:1.5pt" o:hralign="center" o:hrstd="t" o:hr="t" fillcolor="#a0a0a0" stroked="f"/>
+          <v:rect id="_x0000_i1076" style="width:0;height:1.5pt" o:hralign="center" o:hrstd="t" o:hr="t" fillcolor="#a0a0a0" stroked="f"/>
         </w:pict>
       </w:r>
     </w:p>
@@ -11147,7 +10794,7 @@
           <w:rFonts w:ascii="Cambria" w:hAnsi="Cambria"/>
         </w:rPr>
         <w:pict w14:anchorId="7DF08FC3">
-          <v:rect id="_x0000_i1076" style="width:0;height:1.5pt" o:hralign="center" o:hrstd="t" o:hr="t" fillcolor="#a0a0a0" stroked="f"/>
+          <v:rect id="_x0000_i1077" style="width:0;height:1.5pt" o:hralign="center" o:hrstd="t" o:hr="t" fillcolor="#a0a0a0" stroked="f"/>
         </w:pict>
       </w:r>
     </w:p>
@@ -11456,7 +11103,7 @@
           <w:rFonts w:ascii="Cambria" w:hAnsi="Cambria"/>
         </w:rPr>
         <w:pict w14:anchorId="10C831F7">
-          <v:rect id="_x0000_i1077" style="width:0;height:1.5pt" o:hralign="center" o:hrstd="t" o:hr="t" fillcolor="#a0a0a0" stroked="f"/>
+          <v:rect id="_x0000_i1078" style="width:0;height:1.5pt" o:hralign="center" o:hrstd="t" o:hr="t" fillcolor="#a0a0a0" stroked="f"/>
         </w:pict>
       </w:r>
     </w:p>
@@ -11552,7 +11199,7 @@
           <w:rFonts w:ascii="Cambria" w:hAnsi="Cambria"/>
         </w:rPr>
         <w:pict w14:anchorId="6B318999">
-          <v:rect id="_x0000_i1078" style="width:0;height:1.5pt" o:hralign="center" o:hrstd="t" o:hr="t" fillcolor="#a0a0a0" stroked="f"/>
+          <v:rect id="_x0000_i1079" style="width:0;height:1.5pt" o:hralign="center" o:hrstd="t" o:hr="t" fillcolor="#a0a0a0" stroked="f"/>
         </w:pict>
       </w:r>
     </w:p>
@@ -11675,7 +11322,7 @@
           <w:rFonts w:ascii="Cambria" w:hAnsi="Cambria"/>
         </w:rPr>
         <w:pict w14:anchorId="6678AD9D">
-          <v:rect id="_x0000_i1079" style="width:0;height:1.5pt" o:hralign="center" o:hrstd="t" o:hr="t" fillcolor="#a0a0a0" stroked="f"/>
+          <v:rect id="_x0000_i1080" style="width:0;height:1.5pt" o:hralign="center" o:hrstd="t" o:hr="t" fillcolor="#a0a0a0" stroked="f"/>
         </w:pict>
       </w:r>
     </w:p>
@@ -11721,7 +11368,7 @@
           <w:rFonts w:ascii="Cambria" w:hAnsi="Cambria"/>
         </w:rPr>
         <w:pict w14:anchorId="3EA943C4">
-          <v:rect id="_x0000_i1080" style="width:0;height:1.5pt" o:hralign="center" o:hrstd="t" o:hr="t" fillcolor="#a0a0a0" stroked="f"/>
+          <v:rect id="_x0000_i1081" style="width:0;height:1.5pt" o:hralign="center" o:hrstd="t" o:hr="t" fillcolor="#a0a0a0" stroked="f"/>
         </w:pict>
       </w:r>
     </w:p>
@@ -11830,7 +11477,7 @@
           <w:rFonts w:ascii="Cambria" w:hAnsi="Cambria"/>
         </w:rPr>
         <w:pict w14:anchorId="7E9986F9">
-          <v:rect id="_x0000_i1081" style="width:0;height:1.5pt" o:hralign="center" o:hrstd="t" o:hr="t" fillcolor="#a0a0a0" stroked="f"/>
+          <v:rect id="_x0000_i1082" style="width:0;height:1.5pt" o:hralign="center" o:hrstd="t" o:hr="t" fillcolor="#a0a0a0" stroked="f"/>
         </w:pict>
       </w:r>
     </w:p>
@@ -11896,7 +11543,7 @@
           <w:rFonts w:ascii="Cambria" w:hAnsi="Cambria"/>
         </w:rPr>
         <w:pict w14:anchorId="62DBF751">
-          <v:rect id="_x0000_i1082" style="width:0;height:1.5pt" o:hralign="center" o:hrstd="t" o:hr="t" fillcolor="#a0a0a0" stroked="f"/>
+          <v:rect id="_x0000_i1083" style="width:0;height:1.5pt" o:hralign="center" o:hrstd="t" o:hr="t" fillcolor="#a0a0a0" stroked="f"/>
         </w:pict>
       </w:r>
     </w:p>
@@ -12078,7 +11725,7 @@
           <w:rFonts w:ascii="Cambria" w:hAnsi="Cambria"/>
         </w:rPr>
         <w:pict w14:anchorId="6E04AA56">
-          <v:rect id="_x0000_i1083" style="width:0;height:1.5pt" o:hralign="center" o:hrstd="t" o:hr="t" fillcolor="#a0a0a0" stroked="f"/>
+          <v:rect id="_x0000_i1084" style="width:0;height:1.5pt" o:hralign="center" o:hrstd="t" o:hr="t" fillcolor="#a0a0a0" stroked="f"/>
         </w:pict>
       </w:r>
     </w:p>
@@ -12222,7 +11869,7 @@
           <w:rFonts w:ascii="Cambria" w:hAnsi="Cambria"/>
         </w:rPr>
         <w:pict w14:anchorId="2DCC74D2">
-          <v:rect id="_x0000_i1084" style="width:0;height:1.5pt" o:hralign="center" o:hrstd="t" o:hr="t" fillcolor="#a0a0a0" stroked="f"/>
+          <v:rect id="_x0000_i1085" style="width:0;height:1.5pt" o:hralign="center" o:hrstd="t" o:hr="t" fillcolor="#a0a0a0" stroked="f"/>
         </w:pict>
       </w:r>
     </w:p>
@@ -12443,7 +12090,7 @@
           <w:rFonts w:ascii="Cambria" w:hAnsi="Cambria"/>
         </w:rPr>
         <w:pict w14:anchorId="17AA5A68">
-          <v:rect id="_x0000_i1085" style="width:0;height:1.5pt" o:hralign="center" o:hrstd="t" o:hr="t" fillcolor="#a0a0a0" stroked="f"/>
+          <v:rect id="_x0000_i1086" style="width:0;height:1.5pt" o:hralign="center" o:hrstd="t" o:hr="t" fillcolor="#a0a0a0" stroked="f"/>
         </w:pict>
       </w:r>
     </w:p>
@@ -12535,7 +12182,7 @@
           <w:rFonts w:ascii="Cambria" w:hAnsi="Cambria"/>
         </w:rPr>
         <w:pict w14:anchorId="7D5B1182">
-          <v:rect id="_x0000_i1086" style="width:0;height:1.5pt" o:hralign="center" o:hrstd="t" o:hr="t" fillcolor="#a0a0a0" stroked="f"/>
+          <v:rect id="_x0000_i1087" style="width:0;height:1.5pt" o:hralign="center" o:hrstd="t" o:hr="t" fillcolor="#a0a0a0" stroked="f"/>
         </w:pict>
       </w:r>
     </w:p>
@@ -12579,19 +12226,11 @@
           <w:rFonts w:ascii="Cambria" w:hAnsi="Cambria"/>
         </w:rPr>
       </w:pPr>
-      <w:proofErr w:type="spellStart"/>
-      <w:r>
-        <w:rPr>
-          <w:rFonts w:ascii="Cambria" w:hAnsi="Cambria"/>
-        </w:rPr>
-        <w:t>circR</w:t>
-      </w:r>
-      <w:proofErr w:type="spellEnd"/>
-      <w:r>
-        <w:rPr>
-          <w:rFonts w:ascii="Cambria" w:hAnsi="Cambria"/>
-        </w:rPr>
-        <w:t xml:space="preserve"> collapses systematically,</w:t>
+      <w:r>
+        <w:rPr>
+          <w:rFonts w:ascii="Cambria" w:hAnsi="Cambria"/>
+        </w:rPr>
+        <w:t>circR collapses systematically,</w:t>
       </w:r>
     </w:p>
     <w:p>
@@ -12653,7 +12292,7 @@
           <w:rFonts w:ascii="Cambria" w:hAnsi="Cambria"/>
         </w:rPr>
         <w:pict w14:anchorId="29BB9E3E">
-          <v:rect id="_x0000_i1087" style="width:0;height:1.5pt" o:hralign="center" o:hrstd="t" o:hr="t" fillcolor="#a0a0a0" stroked="f"/>
+          <v:rect id="_x0000_i1088" style="width:0;height:1.5pt" o:hralign="center" o:hrstd="t" o:hr="t" fillcolor="#a0a0a0" stroked="f"/>
         </w:pict>
       </w:r>
     </w:p>
@@ -12719,7 +12358,7 @@
           <w:rFonts w:ascii="Cambria" w:hAnsi="Cambria"/>
         </w:rPr>
         <w:pict w14:anchorId="1DB2674C">
-          <v:rect id="_x0000_i1088" style="width:0;height:1.5pt" o:hralign="center" o:hrstd="t" o:hr="t" fillcolor="#a0a0a0" stroked="f"/>
+          <v:rect id="_x0000_i1089" style="width:0;height:1.5pt" o:hralign="center" o:hrstd="t" o:hr="t" fillcolor="#a0a0a0" stroked="f"/>
         </w:pict>
       </w:r>
     </w:p>
@@ -12806,21 +12445,7 @@
         <w:rPr>
           <w:rFonts w:ascii="Cambria" w:hAnsi="Cambria"/>
         </w:rPr>
-        <w:t xml:space="preserve">the result is not determined solely by elevated </w:t>
-      </w:r>
-      <w:proofErr w:type="spellStart"/>
-      <w:r>
-        <w:rPr>
-          <w:rFonts w:ascii="Cambria" w:hAnsi="Cambria"/>
-        </w:rPr>
-        <w:t>circR</w:t>
-      </w:r>
-      <w:proofErr w:type="spellEnd"/>
-      <w:r>
-        <w:rPr>
-          <w:rFonts w:ascii="Cambria" w:hAnsi="Cambria"/>
-        </w:rPr>
-        <w:t xml:space="preserve"> magnitude,</w:t>
+        <w:t>the result is not determined solely by elevated circR magnitude,</w:t>
       </w:r>
     </w:p>
     <w:p>
@@ -12898,7 +12523,7 @@
           <w:rFonts w:ascii="Cambria" w:hAnsi="Cambria"/>
         </w:rPr>
         <w:pict w14:anchorId="60319FFB">
-          <v:rect id="_x0000_i1089" style="width:0;height:1.5pt" o:hralign="center" o:hrstd="t" o:hr="t" fillcolor="#a0a0a0" stroked="f"/>
+          <v:rect id="_x0000_i1090" style="width:0;height:1.5pt" o:hralign="center" o:hrstd="t" o:hr="t" fillcolor="#a0a0a0" stroked="f"/>
         </w:pict>
       </w:r>
     </w:p>
@@ -13020,7 +12645,7 @@
           <w:rFonts w:ascii="Cambria" w:hAnsi="Cambria"/>
         </w:rPr>
         <w:pict w14:anchorId="6AD34410">
-          <v:rect id="_x0000_i1090" style="width:0;height:1.5pt" o:hralign="center" o:hrstd="t" o:hr="t" fillcolor="#a0a0a0" stroked="f"/>
+          <v:rect id="_x0000_i1091" style="width:0;height:1.5pt" o:hralign="center" o:hrstd="t" o:hr="t" fillcolor="#a0a0a0" stroked="f"/>
         </w:pict>
       </w:r>
     </w:p>
@@ -13230,7 +12855,7 @@
           <w:rFonts w:ascii="Cambria" w:hAnsi="Cambria"/>
         </w:rPr>
         <w:pict w14:anchorId="45E6F886">
-          <v:rect id="_x0000_i1091" style="width:0;height:1.5pt" o:hralign="center" o:hrstd="t" o:hr="t" fillcolor="#a0a0a0" stroked="f"/>
+          <v:rect id="_x0000_i1092" style="width:0;height:1.5pt" o:hralign="center" o:hrstd="t" o:hr="t" fillcolor="#a0a0a0" stroked="f"/>
         </w:pict>
       </w:r>
     </w:p>
@@ -13274,19 +12899,11 @@
           <w:rFonts w:ascii="Cambria" w:hAnsi="Cambria"/>
         </w:rPr>
       </w:pPr>
-      <w:proofErr w:type="spellStart"/>
-      <w:r>
-        <w:rPr>
-          <w:rFonts w:ascii="Cambria" w:hAnsi="Cambria"/>
-        </w:rPr>
-        <w:t>gauss_zero</w:t>
-      </w:r>
-      <w:proofErr w:type="spellEnd"/>
-      <w:r>
-        <w:rPr>
-          <w:rFonts w:ascii="Cambria" w:hAnsi="Cambria"/>
-        </w:rPr>
-        <w:t>,</w:t>
+      <w:r>
+        <w:rPr>
+          <w:rFonts w:ascii="Cambria" w:hAnsi="Cambria"/>
+        </w:rPr>
+        <w:t>gauss_zero,</w:t>
       </w:r>
     </w:p>
     <w:p>
@@ -13299,19 +12916,11 @@
           <w:rFonts w:ascii="Cambria" w:hAnsi="Cambria"/>
         </w:rPr>
       </w:pPr>
-      <w:proofErr w:type="spellStart"/>
-      <w:r>
-        <w:rPr>
-          <w:rFonts w:ascii="Cambria" w:hAnsi="Cambria"/>
-        </w:rPr>
-        <w:t>em_swap</w:t>
-      </w:r>
-      <w:proofErr w:type="spellEnd"/>
-      <w:r>
-        <w:rPr>
-          <w:rFonts w:ascii="Cambria" w:hAnsi="Cambria"/>
-        </w:rPr>
-        <w:t>.</w:t>
+      <w:r>
+        <w:rPr>
+          <w:rFonts w:ascii="Cambria" w:hAnsi="Cambria"/>
+        </w:rPr>
+        <w:t>em_swap.</w:t>
       </w:r>
     </w:p>
     <w:p>
@@ -13338,7 +12947,7 @@
           <w:rFonts w:ascii="Cambria" w:hAnsi="Cambria"/>
         </w:rPr>
         <w:pict w14:anchorId="48D8F6EF">
-          <v:rect id="_x0000_i1092" style="width:0;height:1.5pt" o:hralign="center" o:hrstd="t" o:hr="t" fillcolor="#a0a0a0" stroked="f"/>
+          <v:rect id="_x0000_i1093" style="width:0;height:1.5pt" o:hralign="center" o:hrstd="t" o:hr="t" fillcolor="#a0a0a0" stroked="f"/>
         </w:pict>
       </w:r>
     </w:p>
@@ -13498,7 +13107,7 @@
           <w:rFonts w:ascii="Cambria" w:hAnsi="Cambria"/>
         </w:rPr>
         <w:pict w14:anchorId="468608E3">
-          <v:rect id="_x0000_i1093" style="width:0;height:1.5pt" o:hralign="center" o:hrstd="t" o:hr="t" fillcolor="#a0a0a0" stroked="f"/>
+          <v:rect id="_x0000_i1094" style="width:0;height:1.5pt" o:hralign="center" o:hrstd="t" o:hr="t" fillcolor="#a0a0a0" stroked="f"/>
         </w:pict>
       </w:r>
     </w:p>
@@ -13577,7 +13186,7 @@
           <w:rFonts w:ascii="Cambria" w:hAnsi="Cambria"/>
         </w:rPr>
         <w:pict w14:anchorId="1F0FD30B">
-          <v:rect id="_x0000_i1094" style="width:0;height:1.5pt" o:hralign="center" o:hrstd="t" o:hr="t" fillcolor="#a0a0a0" stroked="f"/>
+          <v:rect id="_x0000_i1095" style="width:0;height:1.5pt" o:hralign="center" o:hrstd="t" o:hr="t" fillcolor="#a0a0a0" stroked="f"/>
         </w:pict>
       </w:r>
     </w:p>
@@ -13752,7 +13361,7 @@
           <w:rFonts w:ascii="Cambria" w:hAnsi="Cambria"/>
         </w:rPr>
         <w:pict w14:anchorId="0E1B8443">
-          <v:rect id="_x0000_i1095" style="width:0;height:1.5pt" o:hralign="center" o:hrstd="t" o:hr="t" fillcolor="#a0a0a0" stroked="f"/>
+          <v:rect id="_x0000_i1096" style="width:0;height:1.5pt" o:hralign="center" o:hrstd="t" o:hr="t" fillcolor="#a0a0a0" stroked="f"/>
         </w:pict>
       </w:r>
     </w:p>
@@ -13924,21 +13533,22 @@
       <w:tblPr>
         <w:tblStyle w:val="TableGridLight"/>
         <w:tblW w:w="0" w:type="auto"/>
+        <w:tblLayout w:type="fixed"/>
         <w:tblLook w:val="04A0" w:firstRow="1" w:lastRow="0" w:firstColumn="1" w:lastColumn="0" w:noHBand="0" w:noVBand="1"/>
       </w:tblPr>
       <w:tblGrid>
-        <w:gridCol w:w="1304"/>
-        <w:gridCol w:w="1121"/>
-        <w:gridCol w:w="1467"/>
-        <w:gridCol w:w="1271"/>
-        <w:gridCol w:w="1498"/>
-        <w:gridCol w:w="1605"/>
-        <w:gridCol w:w="1470"/>
+        <w:gridCol w:w="1345"/>
+        <w:gridCol w:w="1170"/>
+        <w:gridCol w:w="1620"/>
+        <w:gridCol w:w="1350"/>
+        <w:gridCol w:w="1620"/>
+        <w:gridCol w:w="990"/>
+        <w:gridCol w:w="1641"/>
       </w:tblGrid>
       <w:tr>
         <w:tc>
           <w:tcPr>
-            <w:tcW w:w="0" w:type="auto"/>
+            <w:tcW w:w="1345" w:type="dxa"/>
             <w:shd w:val="clear" w:color="auto" w:fill="E7E6E6" w:themeFill="background2"/>
             <w:hideMark/>
           </w:tcPr>
@@ -13963,7 +13573,7 @@
         </w:tc>
         <w:tc>
           <w:tcPr>
-            <w:tcW w:w="0" w:type="auto"/>
+            <w:tcW w:w="1170" w:type="dxa"/>
             <w:shd w:val="clear" w:color="auto" w:fill="E7E6E6" w:themeFill="background2"/>
             <w:hideMark/>
           </w:tcPr>
@@ -13988,7 +13598,7 @@
         </w:tc>
         <w:tc>
           <w:tcPr>
-            <w:tcW w:w="0" w:type="auto"/>
+            <w:tcW w:w="1620" w:type="dxa"/>
             <w:shd w:val="clear" w:color="auto" w:fill="E7E6E6" w:themeFill="background2"/>
             <w:hideMark/>
           </w:tcPr>
@@ -14013,7 +13623,7 @@
         </w:tc>
         <w:tc>
           <w:tcPr>
-            <w:tcW w:w="0" w:type="auto"/>
+            <w:tcW w:w="1350" w:type="dxa"/>
             <w:shd w:val="clear" w:color="auto" w:fill="E7E6E6" w:themeFill="background2"/>
             <w:hideMark/>
           </w:tcPr>
@@ -14038,7 +13648,7 @@
         </w:tc>
         <w:tc>
           <w:tcPr>
-            <w:tcW w:w="0" w:type="auto"/>
+            <w:tcW w:w="1620" w:type="dxa"/>
             <w:shd w:val="clear" w:color="auto" w:fill="E7E6E6" w:themeFill="background2"/>
             <w:hideMark/>
           </w:tcPr>
@@ -14063,7 +13673,7 @@
         </w:tc>
         <w:tc>
           <w:tcPr>
-            <w:tcW w:w="0" w:type="auto"/>
+            <w:tcW w:w="990" w:type="dxa"/>
             <w:shd w:val="clear" w:color="auto" w:fill="E7E6E6" w:themeFill="background2"/>
             <w:hideMark/>
           </w:tcPr>
@@ -14088,7 +13698,7 @@
         </w:tc>
         <w:tc>
           <w:tcPr>
-            <w:tcW w:w="0" w:type="auto"/>
+            <w:tcW w:w="1641" w:type="dxa"/>
             <w:shd w:val="clear" w:color="auto" w:fill="E7E6E6" w:themeFill="background2"/>
             <w:hideMark/>
           </w:tcPr>
@@ -14115,7 +13725,7 @@
       <w:tr>
         <w:tc>
           <w:tcPr>
-            <w:tcW w:w="0" w:type="auto"/>
+            <w:tcW w:w="1345" w:type="dxa"/>
             <w:hideMark/>
           </w:tcPr>
           <w:p>
@@ -14135,7 +13745,7 @@
         </w:tc>
         <w:tc>
           <w:tcPr>
-            <w:tcW w:w="0" w:type="auto"/>
+            <w:tcW w:w="1170" w:type="dxa"/>
             <w:hideMark/>
           </w:tcPr>
           <w:p>
@@ -14155,7 +13765,7 @@
         </w:tc>
         <w:tc>
           <w:tcPr>
-            <w:tcW w:w="0" w:type="auto"/>
+            <w:tcW w:w="1620" w:type="dxa"/>
             <w:hideMark/>
           </w:tcPr>
           <w:p>
@@ -14175,7 +13785,7 @@
         </w:tc>
         <w:tc>
           <w:tcPr>
-            <w:tcW w:w="0" w:type="auto"/>
+            <w:tcW w:w="1350" w:type="dxa"/>
             <w:hideMark/>
           </w:tcPr>
           <w:p>
@@ -14195,7 +13805,7 @@
         </w:tc>
         <w:tc>
           <w:tcPr>
-            <w:tcW w:w="0" w:type="auto"/>
+            <w:tcW w:w="1620" w:type="dxa"/>
             <w:hideMark/>
           </w:tcPr>
           <w:p>
@@ -14215,7 +13825,7 @@
         </w:tc>
         <w:tc>
           <w:tcPr>
-            <w:tcW w:w="0" w:type="auto"/>
+            <w:tcW w:w="990" w:type="dxa"/>
             <w:hideMark/>
           </w:tcPr>
           <w:p>
@@ -14235,7 +13845,7 @@
         </w:tc>
         <w:tc>
           <w:tcPr>
-            <w:tcW w:w="0" w:type="auto"/>
+            <w:tcW w:w="1641" w:type="dxa"/>
             <w:hideMark/>
           </w:tcPr>
           <w:p>
@@ -14257,7 +13867,7 @@
       <w:tr>
         <w:tc>
           <w:tcPr>
-            <w:tcW w:w="0" w:type="auto"/>
+            <w:tcW w:w="1345" w:type="dxa"/>
             <w:hideMark/>
           </w:tcPr>
           <w:p>
@@ -14277,7 +13887,7 @@
         </w:tc>
         <w:tc>
           <w:tcPr>
-            <w:tcW w:w="0" w:type="auto"/>
+            <w:tcW w:w="1170" w:type="dxa"/>
             <w:hideMark/>
           </w:tcPr>
           <w:p>
@@ -14297,7 +13907,7 @@
         </w:tc>
         <w:tc>
           <w:tcPr>
-            <w:tcW w:w="0" w:type="auto"/>
+            <w:tcW w:w="1620" w:type="dxa"/>
             <w:hideMark/>
           </w:tcPr>
           <w:p>
@@ -14317,7 +13927,7 @@
         </w:tc>
         <w:tc>
           <w:tcPr>
-            <w:tcW w:w="0" w:type="auto"/>
+            <w:tcW w:w="1350" w:type="dxa"/>
             <w:hideMark/>
           </w:tcPr>
           <w:p>
@@ -14337,7 +13947,7 @@
         </w:tc>
         <w:tc>
           <w:tcPr>
-            <w:tcW w:w="0" w:type="auto"/>
+            <w:tcW w:w="1620" w:type="dxa"/>
             <w:hideMark/>
           </w:tcPr>
           <w:p>
@@ -14357,7 +13967,7 @@
         </w:tc>
         <w:tc>
           <w:tcPr>
-            <w:tcW w:w="0" w:type="auto"/>
+            <w:tcW w:w="990" w:type="dxa"/>
             <w:hideMark/>
           </w:tcPr>
           <w:p>
@@ -14371,13 +13981,33 @@
               <w:rPr>
                 <w:rFonts w:ascii="Cambria" w:hAnsi="Cambria"/>
               </w:rPr>
-              <w:t>PASS_STRONG</w:t>
+              <w:t>PASS_</w:t>
+            </w:r>
+          </w:p>
+          <w:p>
+            <w:pPr>
+              <w:spacing w:line="360" w:lineRule="auto"/>
+              <w:rPr>
+                <w:rFonts w:ascii="Cambria" w:hAnsi="Cambria"/>
+              </w:rPr>
+            </w:pPr>
+            <w:r>
+              <w:rPr>
+                <w:rFonts w:ascii="Cambria" w:hAnsi="Cambria"/>
+              </w:rPr>
+              <w:t>S</w:t>
+            </w:r>
+            <w:r>
+              <w:rPr>
+                <w:rFonts w:ascii="Cambria" w:hAnsi="Cambria"/>
+              </w:rPr>
+              <w:t>trong</w:t>
             </w:r>
           </w:p>
         </w:tc>
         <w:tc>
           <w:tcPr>
-            <w:tcW w:w="0" w:type="auto"/>
+            <w:tcW w:w="1641" w:type="dxa"/>
             <w:hideMark/>
           </w:tcPr>
           <w:p>
@@ -14399,7 +14029,7 @@
       <w:tr>
         <w:tc>
           <w:tcPr>
-            <w:tcW w:w="0" w:type="auto"/>
+            <w:tcW w:w="1345" w:type="dxa"/>
             <w:hideMark/>
           </w:tcPr>
           <w:p>
@@ -14419,7 +14049,7 @@
         </w:tc>
         <w:tc>
           <w:tcPr>
-            <w:tcW w:w="0" w:type="auto"/>
+            <w:tcW w:w="1170" w:type="dxa"/>
             <w:hideMark/>
           </w:tcPr>
           <w:p>
@@ -14439,7 +14069,7 @@
         </w:tc>
         <w:tc>
           <w:tcPr>
-            <w:tcW w:w="0" w:type="auto"/>
+            <w:tcW w:w="1620" w:type="dxa"/>
             <w:hideMark/>
           </w:tcPr>
           <w:p>
@@ -14459,7 +14089,7 @@
         </w:tc>
         <w:tc>
           <w:tcPr>
-            <w:tcW w:w="0" w:type="auto"/>
+            <w:tcW w:w="1350" w:type="dxa"/>
             <w:hideMark/>
           </w:tcPr>
           <w:p>
@@ -14469,33 +14099,17 @@
                 <w:rFonts w:ascii="Cambria" w:hAnsi="Cambria"/>
               </w:rPr>
             </w:pPr>
-            <w:proofErr w:type="spellStart"/>
             <w:r>
               <w:rPr>
                 <w:rFonts w:ascii="Cambria" w:hAnsi="Cambria"/>
               </w:rPr>
-              <w:t>gauss_zero</w:t>
+              <w:t>gauss_zero + em_swap</w:t>
             </w:r>
-            <w:proofErr w:type="spellEnd"/>
-            <w:r>
-              <w:rPr>
-                <w:rFonts w:ascii="Cambria" w:hAnsi="Cambria"/>
-              </w:rPr>
-              <w:t xml:space="preserve"> + </w:t>
-            </w:r>
-            <w:proofErr w:type="spellStart"/>
-            <w:r>
-              <w:rPr>
-                <w:rFonts w:ascii="Cambria" w:hAnsi="Cambria"/>
-              </w:rPr>
-              <w:t>em_swap</w:t>
-            </w:r>
-            <w:proofErr w:type="spellEnd"/>
           </w:p>
         </w:tc>
         <w:tc>
           <w:tcPr>
-            <w:tcW w:w="0" w:type="auto"/>
+            <w:tcW w:w="1620" w:type="dxa"/>
             <w:hideMark/>
           </w:tcPr>
           <w:p>
@@ -14515,7 +14129,7 @@
         </w:tc>
         <w:tc>
           <w:tcPr>
-            <w:tcW w:w="0" w:type="auto"/>
+            <w:tcW w:w="990" w:type="dxa"/>
             <w:hideMark/>
           </w:tcPr>
           <w:p>
@@ -14535,7 +14149,7 @@
         </w:tc>
         <w:tc>
           <w:tcPr>
-            <w:tcW w:w="0" w:type="auto"/>
+            <w:tcW w:w="1641" w:type="dxa"/>
             <w:hideMark/>
           </w:tcPr>
           <w:p>
@@ -14557,7 +14171,7 @@
       <w:tr>
         <w:tc>
           <w:tcPr>
-            <w:tcW w:w="0" w:type="auto"/>
+            <w:tcW w:w="1345" w:type="dxa"/>
             <w:hideMark/>
           </w:tcPr>
           <w:p>
@@ -14577,7 +14191,7 @@
         </w:tc>
         <w:tc>
           <w:tcPr>
-            <w:tcW w:w="0" w:type="auto"/>
+            <w:tcW w:w="1170" w:type="dxa"/>
             <w:hideMark/>
           </w:tcPr>
           <w:p>
@@ -14597,7 +14211,7 @@
         </w:tc>
         <w:tc>
           <w:tcPr>
-            <w:tcW w:w="0" w:type="auto"/>
+            <w:tcW w:w="1620" w:type="dxa"/>
             <w:hideMark/>
           </w:tcPr>
           <w:p>
@@ -14617,7 +14231,7 @@
         </w:tc>
         <w:tc>
           <w:tcPr>
-            <w:tcW w:w="0" w:type="auto"/>
+            <w:tcW w:w="1350" w:type="dxa"/>
             <w:hideMark/>
           </w:tcPr>
           <w:p>
@@ -14627,33 +14241,17 @@
                 <w:rFonts w:ascii="Cambria" w:hAnsi="Cambria"/>
               </w:rPr>
             </w:pPr>
-            <w:proofErr w:type="spellStart"/>
             <w:r>
               <w:rPr>
                 <w:rFonts w:ascii="Cambria" w:hAnsi="Cambria"/>
               </w:rPr>
-              <w:t>gauss_zero</w:t>
+              <w:t>gauss_zero + em_swap</w:t>
             </w:r>
-            <w:proofErr w:type="spellEnd"/>
-            <w:r>
-              <w:rPr>
-                <w:rFonts w:ascii="Cambria" w:hAnsi="Cambria"/>
-              </w:rPr>
-              <w:t xml:space="preserve"> + </w:t>
-            </w:r>
-            <w:proofErr w:type="spellStart"/>
-            <w:r>
-              <w:rPr>
-                <w:rFonts w:ascii="Cambria" w:hAnsi="Cambria"/>
-              </w:rPr>
-              <w:t>em_swap</w:t>
-            </w:r>
-            <w:proofErr w:type="spellEnd"/>
           </w:p>
         </w:tc>
         <w:tc>
           <w:tcPr>
-            <w:tcW w:w="0" w:type="auto"/>
+            <w:tcW w:w="1620" w:type="dxa"/>
             <w:hideMark/>
           </w:tcPr>
           <w:p>
@@ -14673,7 +14271,7 @@
         </w:tc>
         <w:tc>
           <w:tcPr>
-            <w:tcW w:w="0" w:type="auto"/>
+            <w:tcW w:w="990" w:type="dxa"/>
             <w:hideMark/>
           </w:tcPr>
           <w:p>
@@ -14693,7 +14291,7 @@
         </w:tc>
         <w:tc>
           <w:tcPr>
-            <w:tcW w:w="0" w:type="auto"/>
+            <w:tcW w:w="1641" w:type="dxa"/>
             <w:hideMark/>
           </w:tcPr>
           <w:p>
@@ -14744,7 +14342,7 @@
           <w:rFonts w:ascii="Cambria" w:hAnsi="Cambria"/>
         </w:rPr>
         <w:pict w14:anchorId="49A91F95">
-          <v:rect id="_x0000_i1096" style="width:0;height:1.5pt" o:hralign="center" o:hrstd="t" o:hr="t" fillcolor="#a0a0a0" stroked="f"/>
+          <v:rect id="_x0000_i1097" style="width:0;height:1.5pt" o:hralign="center" o:hrstd="t" o:hr="t" fillcolor="#a0a0a0" stroked="f"/>
         </w:pict>
       </w:r>
     </w:p>
@@ -14805,7 +14403,6 @@
         <w:rPr>
           <w:rFonts w:ascii="Cambria" w:hAnsi="Cambria"/>
         </w:rPr>
-        <w:lastRenderedPageBreak/>
         <w:t>interaction is rejected when coordination persists under mismatch,</w:t>
       </w:r>
     </w:p>
@@ -14840,6 +14437,7 @@
         <w:rPr>
           <w:rFonts w:ascii="Cambria" w:hAnsi="Cambria"/>
         </w:rPr>
+        <w:lastRenderedPageBreak/>
         <w:t>and positive outcomes are preserved only when the defining structural constraint is violated correctly under falsification.</w:t>
       </w:r>
     </w:p>
@@ -15064,21 +14662,6 @@
           <w:rFonts w:ascii="Cambria" w:hAnsi="Cambria"/>
         </w:rPr>
         <w:pict w14:anchorId="64505280">
-          <v:rect id="_x0000_i1097" style="width:0;height:1.5pt" o:hralign="center" o:hrstd="t" o:hr="t" fillcolor="#a0a0a0" stroked="f"/>
-        </w:pict>
-      </w:r>
-    </w:p>
-    <w:p>
-      <w:pPr>
-        <w:rPr>
-          <w:rFonts w:ascii="Cambria" w:hAnsi="Cambria"/>
-        </w:rPr>
-      </w:pPr>
-      <w:r>
-        <w:rPr>
-          <w:rFonts w:ascii="Cambria" w:hAnsi="Cambria"/>
-        </w:rPr>
-        <w:pict w14:anchorId="787817E1">
           <v:rect id="_x0000_i1098" style="width:0;height:1.5pt" o:hralign="center" o:hrstd="t" o:hr="t" fillcolor="#a0a0a0" stroked="f"/>
         </w:pict>
       </w:r>
@@ -15092,6 +14675,21 @@
       <w:r>
         <w:rPr>
           <w:rFonts w:ascii="Cambria" w:hAnsi="Cambria"/>
+        </w:rPr>
+        <w:pict w14:anchorId="787817E1">
+          <v:rect id="_x0000_i1099" style="width:0;height:1.5pt" o:hralign="center" o:hrstd="t" o:hr="t" fillcolor="#a0a0a0" stroked="f"/>
+        </w:pict>
+      </w:r>
+    </w:p>
+    <w:p>
+      <w:pPr>
+        <w:rPr>
+          <w:rFonts w:ascii="Cambria" w:hAnsi="Cambria"/>
+        </w:rPr>
+      </w:pPr>
+      <w:r>
+        <w:rPr>
+          <w:rFonts w:ascii="Cambria" w:hAnsi="Cambria"/>
           <w:b/>
           <w:bCs/>
         </w:rPr>
@@ -15109,7 +14707,7 @@
           <w:rFonts w:ascii="Cambria" w:hAnsi="Cambria"/>
         </w:rPr>
         <w:pict w14:anchorId="2E4C2F9A">
-          <v:rect id="_x0000_i1099" style="width:0;height:1.5pt" o:hralign="center" o:hrstd="t" o:hr="t" fillcolor="#a0a0a0" stroked="f"/>
+          <v:rect id="_x0000_i1100" style="width:0;height:1.5pt" o:hralign="center" o:hrstd="t" o:hr="t" fillcolor="#a0a0a0" stroked="f"/>
         </w:pict>
       </w:r>
     </w:p>
@@ -15364,7 +14962,7 @@
           <w:rFonts w:ascii="Cambria" w:hAnsi="Cambria"/>
         </w:rPr>
         <w:pict w14:anchorId="26211BA7">
-          <v:rect id="_x0000_i1100" style="width:0;height:1.5pt" o:hralign="center" o:hrstd="t" o:hr="t" fillcolor="#a0a0a0" stroked="f"/>
+          <v:rect id="_x0000_i1101" style="width:0;height:1.5pt" o:hralign="center" o:hrstd="t" o:hr="t" fillcolor="#a0a0a0" stroked="f"/>
         </w:pict>
       </w:r>
     </w:p>
@@ -15700,7 +15298,7 @@
           <w:rFonts w:ascii="Cambria" w:hAnsi="Cambria"/>
         </w:rPr>
         <w:pict w14:anchorId="5F2E9BB9">
-          <v:rect id="_x0000_i1101" style="width:0;height:1.5pt" o:hralign="center" o:hrstd="t" o:hr="t" fillcolor="#a0a0a0" stroked="f"/>
+          <v:rect id="_x0000_i1102" style="width:0;height:1.5pt" o:hralign="center" o:hrstd="t" o:hr="t" fillcolor="#a0a0a0" stroked="f"/>
         </w:pict>
       </w:r>
     </w:p>
@@ -16134,7 +15732,7 @@
           <w:rFonts w:ascii="Cambria" w:hAnsi="Cambria"/>
         </w:rPr>
         <w:pict w14:anchorId="1A19020B">
-          <v:rect id="_x0000_i1102" style="width:0;height:1.5pt" o:hralign="center" o:hrstd="t" o:hr="t" fillcolor="#a0a0a0" stroked="f"/>
+          <v:rect id="_x0000_i1103" style="width:0;height:1.5pt" o:hralign="center" o:hrstd="t" o:hr="t" fillcolor="#a0a0a0" stroked="f"/>
         </w:pict>
       </w:r>
     </w:p>
@@ -16380,19 +15978,11 @@
                 <w:rFonts w:ascii="Cambria" w:hAnsi="Cambria"/>
               </w:rPr>
             </w:pPr>
-            <w:proofErr w:type="spellStart"/>
             <w:r>
               <w:rPr>
                 <w:rFonts w:ascii="Cambria" w:hAnsi="Cambria"/>
               </w:rPr>
-              <w:t>Kψ</w:t>
-            </w:r>
-            <w:proofErr w:type="spellEnd"/>
-            <w:r>
-              <w:rPr>
-                <w:rFonts w:ascii="Cambria" w:hAnsi="Cambria"/>
-              </w:rPr>
-              <w:t xml:space="preserve"> summaries, null tables, verdict outputs</w:t>
+              <w:t>Kψ summaries, null tables, verdict outputs</w:t>
             </w:r>
           </w:p>
         </w:tc>
@@ -16470,19 +16060,11 @@
                 <w:rFonts w:ascii="Cambria" w:hAnsi="Cambria"/>
               </w:rPr>
             </w:pPr>
-            <w:proofErr w:type="spellStart"/>
             <w:r>
               <w:rPr>
                 <w:rFonts w:ascii="Cambria" w:hAnsi="Cambria"/>
               </w:rPr>
-              <w:t>circR</w:t>
-            </w:r>
-            <w:proofErr w:type="spellEnd"/>
-            <w:r>
-              <w:rPr>
-                <w:rFonts w:ascii="Cambria" w:hAnsi="Cambria"/>
-              </w:rPr>
-              <w:t xml:space="preserve"> tables, mismatch outputs, null summaries</w:t>
+              <w:t>circR tables, mismatch outputs, null summaries</w:t>
             </w:r>
           </w:p>
         </w:tc>
@@ -16639,21 +16221,7 @@
         <w:rPr>
           <w:rFonts w:ascii="Cambria" w:hAnsi="Cambria"/>
         </w:rPr>
-        <w:t xml:space="preserve">  --block-</w:t>
-      </w:r>
-      <w:proofErr w:type="spellStart"/>
-      <w:r>
-        <w:rPr>
-          <w:rFonts w:ascii="Cambria" w:hAnsi="Cambria"/>
-        </w:rPr>
-        <w:t>len</w:t>
-      </w:r>
-      <w:proofErr w:type="spellEnd"/>
-      <w:r>
-        <w:rPr>
-          <w:rFonts w:ascii="Cambria" w:hAnsi="Cambria"/>
-        </w:rPr>
-        <w:t xml:space="preserve"> 1024 ^</w:t>
+        <w:t xml:space="preserve">  --block-len 1024 ^</w:t>
       </w:r>
     </w:p>
     <w:p>
@@ -16759,7 +16327,7 @@
         </w:rPr>
         <w:lastRenderedPageBreak/>
         <w:pict w14:anchorId="63C55B2E">
-          <v:rect id="_x0000_i1103" style="width:0;height:1.5pt" o:hralign="center" o:hrstd="t" o:hr="t" fillcolor="#a0a0a0" stroked="f"/>
+          <v:rect id="_x0000_i1104" style="width:0;height:1.5pt" o:hralign="center" o:hrstd="t" o:hr="t" fillcolor="#a0a0a0" stroked="f"/>
         </w:pict>
       </w:r>
     </w:p>
@@ -16953,16 +16521,12 @@
                 <w:rFonts w:ascii="Cambria" w:hAnsi="Cambria"/>
               </w:rPr>
             </w:pPr>
-            <w:proofErr w:type="spellStart"/>
-            <w:proofErr w:type="gramStart"/>
             <w:r>
               <w:rPr>
                 <w:rFonts w:ascii="Cambria" w:hAnsi="Cambria"/>
               </w:rPr>
               <w:t>contract.json</w:t>
             </w:r>
-            <w:proofErr w:type="spellEnd"/>
-            <w:proofErr w:type="gramEnd"/>
           </w:p>
         </w:tc>
         <w:tc>
@@ -16999,16 +16563,12 @@
                 <w:rFonts w:ascii="Cambria" w:hAnsi="Cambria"/>
               </w:rPr>
             </w:pPr>
-            <w:proofErr w:type="spellStart"/>
-            <w:proofErr w:type="gramStart"/>
             <w:r>
               <w:rPr>
                 <w:rFonts w:ascii="Cambria" w:hAnsi="Cambria"/>
               </w:rPr>
               <w:t>provenance.json</w:t>
             </w:r>
-            <w:proofErr w:type="spellEnd"/>
-            <w:proofErr w:type="gramEnd"/>
           </w:p>
         </w:tc>
         <w:tc>
@@ -17045,16 +16605,12 @@
                 <w:rFonts w:ascii="Cambria" w:hAnsi="Cambria"/>
               </w:rPr>
             </w:pPr>
-            <w:proofErr w:type="spellStart"/>
-            <w:proofErr w:type="gramStart"/>
             <w:r>
               <w:rPr>
                 <w:rFonts w:ascii="Cambria" w:hAnsi="Cambria"/>
               </w:rPr>
               <w:t>summary.json</w:t>
             </w:r>
-            <w:proofErr w:type="spellEnd"/>
-            <w:proofErr w:type="gramEnd"/>
           </w:p>
         </w:tc>
         <w:tc>
@@ -17091,16 +16647,12 @@
                 <w:rFonts w:ascii="Cambria" w:hAnsi="Cambria"/>
               </w:rPr>
             </w:pPr>
-            <w:proofErr w:type="spellStart"/>
-            <w:proofErr w:type="gramStart"/>
             <w:r>
               <w:rPr>
                 <w:rFonts w:ascii="Cambria" w:hAnsi="Cambria"/>
               </w:rPr>
               <w:t>index.json</w:t>
             </w:r>
-            <w:proofErr w:type="spellEnd"/>
-            <w:proofErr w:type="gramEnd"/>
           </w:p>
         </w:tc>
         <w:tc>
@@ -17483,7 +17035,7 @@
           <w:rFonts w:ascii="Cambria" w:hAnsi="Cambria"/>
         </w:rPr>
         <w:pict w14:anchorId="6245C441">
-          <v:rect id="_x0000_i1104" style="width:0;height:1.5pt" o:hralign="center" o:hrstd="t" o:hr="t" fillcolor="#a0a0a0" stroked="f"/>
+          <v:rect id="_x0000_i1105" style="width:0;height:1.5pt" o:hralign="center" o:hrstd="t" o:hr="t" fillcolor="#a0a0a0" stroked="f"/>
         </w:pict>
       </w:r>
     </w:p>
@@ -18205,7 +17757,7 @@
           <w:rFonts w:ascii="Cambria" w:hAnsi="Cambria"/>
         </w:rPr>
         <w:pict w14:anchorId="2986DA4A">
-          <v:rect id="_x0000_i1105" style="width:0;height:1.5pt" o:hralign="center" o:hrstd="t" o:hr="t" fillcolor="#a0a0a0" stroked="f"/>
+          <v:rect id="_x0000_i1106" style="width:0;height:1.5pt" o:hralign="center" o:hrstd="t" o:hr="t" fillcolor="#a0a0a0" stroked="f"/>
         </w:pict>
       </w:r>
     </w:p>
@@ -18584,7 +18136,7 @@
           <w:rFonts w:ascii="Cambria" w:hAnsi="Cambria"/>
         </w:rPr>
         <w:pict w14:anchorId="35711935">
-          <v:rect id="_x0000_i1106" style="width:0;height:1.5pt" o:hralign="center" o:hrstd="t" o:hr="t" fillcolor="#a0a0a0" stroked="f"/>
+          <v:rect id="_x0000_i1107" style="width:0;height:1.5pt" o:hralign="center" o:hrstd="t" o:hr="t" fillcolor="#a0a0a0" stroked="f"/>
         </w:pict>
       </w:r>
     </w:p>
@@ -19165,7 +18717,7 @@
           <w:rFonts w:ascii="Cambria" w:hAnsi="Cambria"/>
         </w:rPr>
         <w:pict w14:anchorId="4EE0D54D">
-          <v:rect id="_x0000_i1107" style="width:0;height:1.5pt" o:hralign="center" o:hrstd="t" o:hr="t" fillcolor="#a0a0a0" stroked="f"/>
+          <v:rect id="_x0000_i1108" style="width:0;height:1.5pt" o:hralign="center" o:hrstd="t" o:hr="t" fillcolor="#a0a0a0" stroked="f"/>
         </w:pict>
       </w:r>
     </w:p>
@@ -19321,21 +18873,6 @@
           <w:rFonts w:ascii="Cambria" w:hAnsi="Cambria"/>
         </w:rPr>
         <w:pict w14:anchorId="63269B35">
-          <v:rect id="_x0000_i1108" style="width:0;height:1.5pt" o:hralign="center" o:hrstd="t" o:hr="t" fillcolor="#a0a0a0" stroked="f"/>
-        </w:pict>
-      </w:r>
-    </w:p>
-    <w:p>
-      <w:pPr>
-        <w:rPr>
-          <w:rFonts w:ascii="Cambria" w:hAnsi="Cambria"/>
-        </w:rPr>
-      </w:pPr>
-      <w:r>
-        <w:rPr>
-          <w:rFonts w:ascii="Cambria" w:hAnsi="Cambria"/>
-        </w:rPr>
-        <w:pict w14:anchorId="55C4DE71">
           <v:rect id="_x0000_i1109" style="width:0;height:1.5pt" o:hralign="center" o:hrstd="t" o:hr="t" fillcolor="#a0a0a0" stroked="f"/>
         </w:pict>
       </w:r>
@@ -19349,6 +18886,21 @@
       <w:r>
         <w:rPr>
           <w:rFonts w:ascii="Cambria" w:hAnsi="Cambria"/>
+        </w:rPr>
+        <w:pict w14:anchorId="55C4DE71">
+          <v:rect id="_x0000_i1110" style="width:0;height:1.5pt" o:hralign="center" o:hrstd="t" o:hr="t" fillcolor="#a0a0a0" stroked="f"/>
+        </w:pict>
+      </w:r>
+    </w:p>
+    <w:p>
+      <w:pPr>
+        <w:rPr>
+          <w:rFonts w:ascii="Cambria" w:hAnsi="Cambria"/>
+        </w:rPr>
+      </w:pPr>
+      <w:r>
+        <w:rPr>
+          <w:rFonts w:ascii="Cambria" w:hAnsi="Cambria"/>
           <w:b/>
           <w:bCs/>
         </w:rPr>
@@ -19366,7 +18918,7 @@
           <w:rFonts w:ascii="Cambria" w:hAnsi="Cambria"/>
         </w:rPr>
         <w:pict w14:anchorId="08B6A51E">
-          <v:rect id="_x0000_i1110" style="width:0;height:1.5pt" o:hralign="center" o:hrstd="t" o:hr="t" fillcolor="#a0a0a0" stroked="f"/>
+          <v:rect id="_x0000_i1111" style="width:0;height:1.5pt" o:hralign="center" o:hrstd="t" o:hr="t" fillcolor="#a0a0a0" stroked="f"/>
         </w:pict>
       </w:r>
     </w:p>
@@ -19478,21 +19030,7 @@
         <w:rPr>
           <w:rFonts w:ascii="Cambria" w:hAnsi="Cambria"/>
         </w:rPr>
-        <w:t xml:space="preserve">additional </w:t>
-      </w:r>
-      <w:proofErr w:type="spellStart"/>
-      <w:r>
-        <w:rPr>
-          <w:rFonts w:ascii="Cambria" w:hAnsi="Cambria"/>
-        </w:rPr>
-        <w:t>pair</w:t>
-      </w:r>
-      <w:proofErr w:type="spellEnd"/>
-      <w:r>
-        <w:rPr>
-          <w:rFonts w:ascii="Cambria" w:hAnsi="Cambria"/>
-        </w:rPr>
-        <w:t>-level evaluations,</w:t>
+        <w:t>additional pair-level evaluations,</w:t>
       </w:r>
     </w:p>
     <w:p>
@@ -19550,7 +19088,7 @@
           <w:rFonts w:ascii="Cambria" w:hAnsi="Cambria"/>
         </w:rPr>
         <w:pict w14:anchorId="693D27BA">
-          <v:rect id="_x0000_i1111" style="width:0;height:1.5pt" o:hralign="center" o:hrstd="t" o:hr="t" fillcolor="#a0a0a0" stroked="f"/>
+          <v:rect id="_x0000_i1112" style="width:0;height:1.5pt" o:hralign="center" o:hrstd="t" o:hr="t" fillcolor="#a0a0a0" stroked="f"/>
         </w:pict>
       </w:r>
     </w:p>
@@ -19611,21 +19149,7 @@
         <w:rPr>
           <w:rFonts w:ascii="Cambria" w:hAnsi="Cambria"/>
         </w:rPr>
-        <w:t xml:space="preserve">window-level </w:t>
-      </w:r>
-      <w:proofErr w:type="spellStart"/>
-      <w:r>
-        <w:rPr>
-          <w:rFonts w:ascii="Cambria" w:hAnsi="Cambria"/>
-        </w:rPr>
-        <w:t>Kψ</w:t>
-      </w:r>
-      <w:proofErr w:type="spellEnd"/>
-      <w:r>
-        <w:rPr>
-          <w:rFonts w:ascii="Cambria" w:hAnsi="Cambria"/>
-        </w:rPr>
-        <w:t xml:space="preserve"> distributions,</w:t>
+        <w:t>window-level Kψ distributions,</w:t>
       </w:r>
     </w:p>
     <w:p>
@@ -19800,21 +19324,7 @@
               <w:rPr>
                 <w:rFonts w:ascii="Cambria" w:hAnsi="Cambria"/>
               </w:rPr>
-              <w:t xml:space="preserve">window-level </w:t>
-            </w:r>
-            <w:proofErr w:type="spellStart"/>
-            <w:r>
-              <w:rPr>
-                <w:rFonts w:ascii="Cambria" w:hAnsi="Cambria"/>
-              </w:rPr>
-              <w:t>Kψ</w:t>
-            </w:r>
-            <w:proofErr w:type="spellEnd"/>
-            <w:r>
-              <w:rPr>
-                <w:rFonts w:ascii="Cambria" w:hAnsi="Cambria"/>
-              </w:rPr>
-              <w:t xml:space="preserve"> summaries</w:t>
+              <w:t>window-level Kψ summaries</w:t>
             </w:r>
           </w:p>
         </w:tc>
@@ -20039,7 +19549,7 @@
           <w:rFonts w:ascii="Cambria" w:hAnsi="Cambria"/>
         </w:rPr>
         <w:pict w14:anchorId="6A29F557">
-          <v:rect id="_x0000_i1112" style="width:0;height:1.5pt" o:hralign="center" o:hrstd="t" o:hr="t" fillcolor="#a0a0a0" stroked="f"/>
+          <v:rect id="_x0000_i1113" style="width:0;height:1.5pt" o:hralign="center" o:hrstd="t" o:hr="t" fillcolor="#a0a0a0" stroked="f"/>
         </w:pict>
       </w:r>
     </w:p>
@@ -20169,21 +19679,7 @@
         <w:rPr>
           <w:rFonts w:ascii="Cambria" w:hAnsi="Cambria"/>
         </w:rPr>
-        <w:t xml:space="preserve">timeline-level </w:t>
-      </w:r>
-      <w:proofErr w:type="spellStart"/>
-      <w:r>
-        <w:rPr>
-          <w:rFonts w:ascii="Cambria" w:hAnsi="Cambria"/>
-        </w:rPr>
-        <w:t>circR</w:t>
-      </w:r>
-      <w:proofErr w:type="spellEnd"/>
-      <w:r>
-        <w:rPr>
-          <w:rFonts w:ascii="Cambria" w:hAnsi="Cambria"/>
-        </w:rPr>
-        <w:t xml:space="preserve"> summaries,</w:t>
+        <w:t>timeline-level circR summaries,</w:t>
       </w:r>
     </w:p>
     <w:p>
@@ -20327,21 +19823,7 @@
               <w:rPr>
                 <w:rFonts w:ascii="Cambria" w:hAnsi="Cambria"/>
               </w:rPr>
-              <w:t xml:space="preserve">aligned versus mismatch </w:t>
-            </w:r>
-            <w:proofErr w:type="spellStart"/>
-            <w:r>
-              <w:rPr>
-                <w:rFonts w:ascii="Cambria" w:hAnsi="Cambria"/>
-              </w:rPr>
-              <w:t>circR</w:t>
-            </w:r>
-            <w:proofErr w:type="spellEnd"/>
-            <w:r>
-              <w:rPr>
-                <w:rFonts w:ascii="Cambria" w:hAnsi="Cambria"/>
-              </w:rPr>
-              <w:t xml:space="preserve"> comparisons</w:t>
+              <w:t>aligned versus mismatch circR comparisons</w:t>
             </w:r>
           </w:p>
         </w:tc>
@@ -20489,21 +19971,7 @@
               <w:rPr>
                 <w:rFonts w:ascii="Cambria" w:hAnsi="Cambria"/>
               </w:rPr>
-              <w:t xml:space="preserve">timeline </w:t>
-            </w:r>
-            <w:proofErr w:type="spellStart"/>
-            <w:r>
-              <w:rPr>
-                <w:rFonts w:ascii="Cambria" w:hAnsi="Cambria"/>
-              </w:rPr>
-              <w:t>circR</w:t>
-            </w:r>
-            <w:proofErr w:type="spellEnd"/>
-            <w:r>
-              <w:rPr>
-                <w:rFonts w:ascii="Cambria" w:hAnsi="Cambria"/>
-              </w:rPr>
-              <w:t xml:space="preserve"> summaries</w:t>
+              <w:t>timeline circR summaries</w:t>
             </w:r>
           </w:p>
         </w:tc>
@@ -20602,7 +20070,7 @@
           <w:rFonts w:ascii="Cambria" w:hAnsi="Cambria"/>
         </w:rPr>
         <w:pict w14:anchorId="66B60496">
-          <v:rect id="_x0000_i1113" style="width:0;height:1.5pt" o:hralign="center" o:hrstd="t" o:hr="t" fillcolor="#a0a0a0" stroked="f"/>
+          <v:rect id="_x0000_i1114" style="width:0;height:1.5pt" o:hralign="center" o:hrstd="t" o:hr="t" fillcolor="#a0a0a0" stroked="f"/>
         </w:pict>
       </w:r>
     </w:p>
@@ -20676,19 +20144,11 @@
           <w:rFonts w:ascii="Cambria" w:hAnsi="Cambria"/>
         </w:rPr>
       </w:pPr>
-      <w:proofErr w:type="spellStart"/>
-      <w:r>
-        <w:rPr>
-          <w:rFonts w:ascii="Cambria" w:hAnsi="Cambria"/>
-        </w:rPr>
-        <w:t>gauss_zero</w:t>
-      </w:r>
-      <w:proofErr w:type="spellEnd"/>
-      <w:r>
-        <w:rPr>
-          <w:rFonts w:ascii="Cambria" w:hAnsi="Cambria"/>
-        </w:rPr>
-        <w:t xml:space="preserve"> comparison outputs,</w:t>
+      <w:r>
+        <w:rPr>
+          <w:rFonts w:ascii="Cambria" w:hAnsi="Cambria"/>
+        </w:rPr>
+        <w:t>gauss_zero comparison outputs,</w:t>
       </w:r>
     </w:p>
     <w:p>
@@ -20701,19 +20161,11 @@
           <w:rFonts w:ascii="Cambria" w:hAnsi="Cambria"/>
         </w:rPr>
       </w:pPr>
-      <w:proofErr w:type="spellStart"/>
-      <w:r>
-        <w:rPr>
-          <w:rFonts w:ascii="Cambria" w:hAnsi="Cambria"/>
-        </w:rPr>
-        <w:t>em_swap</w:t>
-      </w:r>
-      <w:proofErr w:type="spellEnd"/>
-      <w:r>
-        <w:rPr>
-          <w:rFonts w:ascii="Cambria" w:hAnsi="Cambria"/>
-        </w:rPr>
-        <w:t xml:space="preserve"> comparison outputs,</w:t>
+      <w:r>
+        <w:rPr>
+          <w:rFonts w:ascii="Cambria" w:hAnsi="Cambria"/>
+        </w:rPr>
+        <w:t>em_swap comparison outputs,</w:t>
       </w:r>
     </w:p>
     <w:p>
@@ -20911,19 +20363,11 @@
                 <w:rFonts w:ascii="Cambria" w:hAnsi="Cambria"/>
               </w:rPr>
             </w:pPr>
-            <w:proofErr w:type="spellStart"/>
             <w:r>
               <w:rPr>
                 <w:rFonts w:ascii="Cambria" w:hAnsi="Cambria"/>
               </w:rPr>
-              <w:t>gauss_zero</w:t>
-            </w:r>
-            <w:proofErr w:type="spellEnd"/>
-            <w:r>
-              <w:rPr>
-                <w:rFonts w:ascii="Cambria" w:hAnsi="Cambria"/>
-              </w:rPr>
-              <w:t xml:space="preserve"> comparisons</w:t>
+              <w:t>gauss_zero comparisons</w:t>
             </w:r>
           </w:p>
         </w:tc>
@@ -20961,19 +20405,11 @@
                 <w:rFonts w:ascii="Cambria" w:hAnsi="Cambria"/>
               </w:rPr>
             </w:pPr>
-            <w:proofErr w:type="spellStart"/>
             <w:r>
               <w:rPr>
                 <w:rFonts w:ascii="Cambria" w:hAnsi="Cambria"/>
               </w:rPr>
-              <w:t>em_swap</w:t>
-            </w:r>
-            <w:proofErr w:type="spellEnd"/>
-            <w:r>
-              <w:rPr>
-                <w:rFonts w:ascii="Cambria" w:hAnsi="Cambria"/>
-              </w:rPr>
-              <w:t xml:space="preserve"> comparisons</w:t>
+              <w:t>em_swap comparisons</w:t>
             </w:r>
           </w:p>
         </w:tc>
@@ -21114,7 +20550,7 @@
           <w:rFonts w:ascii="Cambria" w:hAnsi="Cambria"/>
         </w:rPr>
         <w:pict w14:anchorId="61AE6610">
-          <v:rect id="_x0000_i1114" style="width:0;height:1.5pt" o:hralign="center" o:hrstd="t" o:hr="t" fillcolor="#a0a0a0" stroked="f"/>
+          <v:rect id="_x0000_i1115" style="width:0;height:1.5pt" o:hralign="center" o:hrstd="t" o:hr="t" fillcolor="#a0a0a0" stroked="f"/>
         </w:pict>
       </w:r>
     </w:p>
@@ -21753,7 +21189,7 @@
           <w:rFonts w:ascii="Cambria" w:hAnsi="Cambria"/>
         </w:rPr>
         <w:pict w14:anchorId="319BC384">
-          <v:rect id="_x0000_i1115" style="width:0;height:1.5pt" o:hralign="center" o:hrstd="t" o:hr="t" fillcolor="#a0a0a0" stroked="f"/>
+          <v:rect id="_x0000_i1116" style="width:0;height:1.5pt" o:hralign="center" o:hrstd="t" o:hr="t" fillcolor="#a0a0a0" stroked="f"/>
         </w:pict>
       </w:r>
     </w:p>
@@ -22356,21 +21792,6 @@
           <w:rFonts w:ascii="Cambria" w:hAnsi="Cambria"/>
         </w:rPr>
         <w:pict w14:anchorId="3FA86BAE">
-          <v:rect id="_x0000_i1116" style="width:0;height:1.5pt" o:hralign="center" o:hrstd="t" o:hr="t" fillcolor="#a0a0a0" stroked="f"/>
-        </w:pict>
-      </w:r>
-    </w:p>
-    <w:p>
-      <w:pPr>
-        <w:rPr>
-          <w:rFonts w:ascii="Cambria" w:hAnsi="Cambria"/>
-        </w:rPr>
-      </w:pPr>
-      <w:r>
-        <w:rPr>
-          <w:rFonts w:ascii="Cambria" w:hAnsi="Cambria"/>
-        </w:rPr>
-        <w:pict w14:anchorId="3699BD5B">
           <v:rect id="_x0000_i1117" style="width:0;height:1.5pt" o:hralign="center" o:hrstd="t" o:hr="t" fillcolor="#a0a0a0" stroked="f"/>
         </w:pict>
       </w:r>
@@ -22379,6 +21800,21 @@
       <w:pPr>
         <w:rPr>
           <w:rFonts w:ascii="Cambria" w:hAnsi="Cambria"/>
+        </w:rPr>
+      </w:pPr>
+      <w:r>
+        <w:rPr>
+          <w:rFonts w:ascii="Cambria" w:hAnsi="Cambria"/>
+        </w:rPr>
+        <w:pict w14:anchorId="3699BD5B">
+          <v:rect id="_x0000_i1118" style="width:0;height:1.5pt" o:hralign="center" o:hrstd="t" o:hr="t" fillcolor="#a0a0a0" stroked="f"/>
+        </w:pict>
+      </w:r>
+    </w:p>
+    <w:p>
+      <w:pPr>
+        <w:rPr>
+          <w:rFonts w:ascii="Cambria" w:hAnsi="Cambria"/>
           <w:b/>
           <w:bCs/>
         </w:rPr>
@@ -22403,7 +21839,7 @@
           <w:rFonts w:ascii="Cambria" w:hAnsi="Cambria"/>
         </w:rPr>
         <w:pict w14:anchorId="1FFB76EA">
-          <v:rect id="_x0000_i1118" style="width:0;height:1.5pt" o:hralign="center" o:hrstd="t" o:hr="t" fillcolor="#a0a0a0" stroked="f"/>
+          <v:rect id="_x0000_i1119" style="width:0;height:1.5pt" o:hralign="center" o:hrstd="t" o:hr="t" fillcolor="#a0a0a0" stroked="f"/>
         </w:pict>
       </w:r>
     </w:p>
@@ -22516,7 +21952,7 @@
           <w:rFonts w:ascii="Cambria" w:hAnsi="Cambria"/>
         </w:rPr>
         <w:pict w14:anchorId="0D0DA9AE">
-          <v:rect id="_x0000_i1119" style="width:0;height:1.5pt" o:hralign="center" o:hrstd="t" o:hr="t" fillcolor="#a0a0a0" stroked="f"/>
+          <v:rect id="_x0000_i1120" style="width:0;height:1.5pt" o:hralign="center" o:hrstd="t" o:hr="t" fillcolor="#a0a0a0" stroked="f"/>
         </w:pict>
       </w:r>
     </w:p>
@@ -22646,7 +22082,7 @@
           <w:rFonts w:ascii="Cambria" w:hAnsi="Cambria"/>
         </w:rPr>
         <w:pict w14:anchorId="6033344D">
-          <v:rect id="_x0000_i1120" style="width:0;height:1.5pt" o:hralign="center" o:hrstd="t" o:hr="t" fillcolor="#a0a0a0" stroked="f"/>
+          <v:rect id="_x0000_i1121" style="width:0;height:1.5pt" o:hralign="center" o:hrstd="t" o:hr="t" fillcolor="#a0a0a0" stroked="f"/>
         </w:pict>
       </w:r>
     </w:p>
@@ -22685,21 +22121,7 @@
         <w:rPr>
           <w:rFonts w:ascii="Cambria" w:hAnsi="Cambria"/>
         </w:rPr>
-        <w:t xml:space="preserve">GOES n₂ mismatch-collapse summary under aligned, mismatch, phase-randomized, and block-shuffle conditions. The aligned configuration exhibits elevated </w:t>
-      </w:r>
-      <w:proofErr w:type="spellStart"/>
-      <w:r>
-        <w:rPr>
-          <w:rFonts w:ascii="Cambria" w:hAnsi="Cambria"/>
-        </w:rPr>
-        <w:t>circR</w:t>
-      </w:r>
-      <w:proofErr w:type="spellEnd"/>
-      <w:r>
-        <w:rPr>
-          <w:rFonts w:ascii="Cambria" w:hAnsi="Cambria"/>
-        </w:rPr>
-        <w:t xml:space="preserve">, whereas mismatch pairing produces strong collapse of the interaction observable. This supports the </w:t>
+        <w:t xml:space="preserve">GOES n₂ mismatch-collapse summary under aligned, mismatch, phase-randomized, and block-shuffle conditions. The aligned configuration exhibits elevated circR, whereas mismatch pairing produces strong collapse of the interaction observable. This supports the </w:t>
       </w:r>
       <w:r>
         <w:rPr>
@@ -22789,7 +22211,7 @@
           <w:rFonts w:ascii="Cambria" w:hAnsi="Cambria"/>
         </w:rPr>
         <w:pict w14:anchorId="276A61BD">
-          <v:rect id="_x0000_i1121" style="width:0;height:1.5pt" o:hralign="center" o:hrstd="t" o:hr="t" fillcolor="#a0a0a0" stroked="f"/>
+          <v:rect id="_x0000_i1122" style="width:0;height:1.5pt" o:hralign="center" o:hrstd="t" o:hr="t" fillcolor="#a0a0a0" stroked="f"/>
         </w:pict>
       </w:r>
     </w:p>
@@ -22856,21 +22278,7 @@
         <w:rPr>
           <w:rFonts w:ascii="Cambria" w:hAnsi="Cambria"/>
         </w:rPr>
-        <w:t xml:space="preserve">, not by </w:t>
-      </w:r>
-      <w:proofErr w:type="spellStart"/>
-      <w:r>
-        <w:rPr>
-          <w:rFonts w:ascii="Cambria" w:hAnsi="Cambria"/>
-        </w:rPr>
-        <w:t>circR</w:t>
-      </w:r>
-      <w:proofErr w:type="spellEnd"/>
-      <w:r>
-        <w:rPr>
-          <w:rFonts w:ascii="Cambria" w:hAnsi="Cambria"/>
-        </w:rPr>
-        <w:t xml:space="preserve"> magnitude alone.</w:t>
+        <w:t>, not by circR magnitude alone.</w:t>
       </w:r>
     </w:p>
     <w:p>
@@ -22946,7 +22354,7 @@
         </w:rPr>
         <w:lastRenderedPageBreak/>
         <w:pict w14:anchorId="37345B7D">
-          <v:rect id="_x0000_i1122" style="width:0;height:1.5pt" o:hralign="center" o:hrstd="t" o:hr="t" fillcolor="#a0a0a0" stroked="f"/>
+          <v:rect id="_x0000_i1123" style="width:0;height:1.5pt" o:hralign="center" o:hrstd="t" o:hr="t" fillcolor="#a0a0a0" stroked="f"/>
         </w:pict>
       </w:r>
     </w:p>
@@ -22985,35 +22393,7 @@
         <w:rPr>
           <w:rFonts w:ascii="Cambria" w:hAnsi="Cambria"/>
         </w:rPr>
-        <w:t xml:space="preserve">n₄ closure-control comparison under real pairing and mandatory closure-breaking controls. The real configuration exhibits lower abs_C4_median than both </w:t>
-      </w:r>
-      <w:proofErr w:type="spellStart"/>
-      <w:r>
-        <w:rPr>
-          <w:rFonts w:ascii="Cambria" w:hAnsi="Cambria"/>
-        </w:rPr>
-        <w:t>gauss_zero</w:t>
-      </w:r>
-      <w:proofErr w:type="spellEnd"/>
-      <w:r>
-        <w:rPr>
-          <w:rFonts w:ascii="Cambria" w:hAnsi="Cambria"/>
-        </w:rPr>
-        <w:t xml:space="preserve"> and </w:t>
-      </w:r>
-      <w:proofErr w:type="spellStart"/>
-      <w:r>
-        <w:rPr>
-          <w:rFonts w:ascii="Cambria" w:hAnsi="Cambria"/>
-        </w:rPr>
-        <w:t>em_swap</w:t>
-      </w:r>
-      <w:proofErr w:type="spellEnd"/>
-      <w:r>
-        <w:rPr>
-          <w:rFonts w:ascii="Cambria" w:hAnsi="Cambria"/>
-        </w:rPr>
-        <w:t xml:space="preserve"> controls in the representative PASS case, demonstrating directional degradation under perturbation. This supports the frozen n₄ closure contract, where closure is accepted only when real pairing remains lower than all required controls.</w:t>
+        <w:t>n₄ closure-control comparison under real pairing and mandatory closure-breaking controls. The real configuration exhibits lower abs_C4_median than both gauss_zero and em_swap controls in the representative PASS case, demonstrating directional degradation under perturbation. This supports the frozen n₄ closure contract, where closure is accepted only when real pairing remains lower than all required controls.</w:t>
       </w:r>
     </w:p>
     <w:p>
@@ -23088,7 +22468,7 @@
           <w:rFonts w:ascii="Cambria" w:hAnsi="Cambria"/>
         </w:rPr>
         <w:pict w14:anchorId="6EA69D5A">
-          <v:rect id="_x0000_i1123" style="width:0;height:1.5pt" o:hralign="center" o:hrstd="t" o:hr="t" fillcolor="#a0a0a0" stroked="f"/>
+          <v:rect id="_x0000_i1124" style="width:0;height:1.5pt" o:hralign="center" o:hrstd="t" o:hr="t" fillcolor="#a0a0a0" stroked="f"/>
         </w:pict>
       </w:r>
     </w:p>
@@ -23217,7 +22597,7 @@
           <w:rFonts w:ascii="Cambria" w:hAnsi="Cambria"/>
         </w:rPr>
         <w:pict w14:anchorId="08EF88D3">
-          <v:rect id="_x0000_i1124" style="width:0;height:1.5pt" o:hralign="center" o:hrstd="t" o:hr="t" fillcolor="#a0a0a0" stroked="f"/>
+          <v:rect id="_x0000_i1125" style="width:0;height:1.5pt" o:hralign="center" o:hrstd="t" o:hr="t" fillcolor="#a0a0a0" stroked="f"/>
         </w:pict>
       </w:r>
     </w:p>
@@ -23331,7 +22711,7 @@
           <w:rFonts w:ascii="Cambria" w:hAnsi="Cambria"/>
         </w:rPr>
         <w:pict w14:anchorId="089FC1D2">
-          <v:rect id="_x0000_i1125" style="width:0;height:1.5pt" o:hralign="center" o:hrstd="t" o:hr="t" fillcolor="#a0a0a0" stroked="f"/>
+          <v:rect id="_x0000_i1126" style="width:0;height:1.5pt" o:hralign="center" o:hrstd="t" o:hr="t" fillcolor="#a0a0a0" stroked="f"/>
         </w:pict>
       </w:r>
     </w:p>
@@ -23347,7 +22727,7 @@
         </w:rPr>
         <w:lastRenderedPageBreak/>
         <w:pict w14:anchorId="3F88ED1B">
-          <v:rect id="_x0000_i1132" style="width:0;height:1.5pt" o:hralign="center" o:hrstd="t" o:hr="t" fillcolor="#a0a0a0" stroked="f"/>
+          <v:rect id="_x0000_i1127" style="width:0;height:1.5pt" o:hralign="center" o:hrstd="t" o:hr="t" fillcolor="#a0a0a0" stroked="f"/>
         </w:pict>
       </w:r>
     </w:p>
@@ -23494,7 +22874,7 @@
 <w:numbering xmlns:wpc="http://schemas.microsoft.com/office/word/2010/wordprocessingCanvas" xmlns:cx="http://schemas.microsoft.com/office/drawing/2014/chartex" xmlns:cx1="http://schemas.microsoft.com/office/drawing/2015/9/8/chartex" xmlns:cx2="http://schemas.microsoft.com/office/drawing/2015/10/21/chartex" xmlns:cx3="http://schemas.microsoft.com/office/drawing/2016/5/9/chartex" xmlns:cx4="http://schemas.microsoft.com/office/drawing/2016/5/10/chartex" xmlns:cx5="http://schemas.microsoft.com/office/drawing/2016/5/11/chartex" xmlns:cx6="http://schemas.microsoft.com/office/drawing/2016/5/12/chartex" xmlns:cx7="http://schemas.microsoft.com/office/drawing/2016/5/13/chartex" xmlns:cx8="http://schemas.microsoft.com/office/drawing/2016/5/14/chartex" xmlns:mc="http://schemas.openxmlformats.org/markup-compatibility/2006" xmlns:aink="http://schemas.microsoft.com/office/drawing/2016/ink" xmlns:am3d="http://schemas.microsoft.com/office/drawing/2017/model3d" xmlns:o="urn:schemas-microsoft-com:office:office" xmlns:oel="http://schemas.microsoft.com/office/2019/extlst" xmlns:r="http://schemas.openxmlformats.org/officeDocument/2006/relationships" xmlns:m="http://schemas.openxmlformats.org/officeDocument/2006/math" xmlns:v="urn:schemas-microsoft-com:vml" xmlns:wp14="http://schemas.microsoft.com/office/word/2010/wordprocessingDrawing" xmlns:wp="http://schemas.openxmlformats.org/drawingml/2006/wordprocessingDrawing" xmlns:w10="urn:schemas-microsoft-com:office:word" xmlns:w="http://schemas.openxmlformats.org/wordprocessingml/2006/main" xmlns:w14="http://schemas.microsoft.com/office/word/2010/wordml" xmlns:w15="http://schemas.microsoft.com/office/word/2012/wordml" xmlns:w16cex="http://schemas.microsoft.com/office/word/2018/wordml/cex" xmlns:w16cid="http://schemas.microsoft.com/office/word/2016/wordml/cid" xmlns:w16="http://schemas.microsoft.com/office/word/2018/wordml" xmlns:w16du="http://schemas.microsoft.com/office/word/2023/wordml/word16du" xmlns:w16sdtdh="http://schemas.microsoft.com/office/word/2020/wordml/sdtdatahash" xmlns:w16sdtfl="http://schemas.microsoft.com/office/word/2024/wordml/sdtformatlock" xmlns:w16se="http://schemas.microsoft.com/office/word/2015/wordml/symex" xmlns:wpg="http://schemas.microsoft.com/office/word/2010/wordprocessingGroup" xmlns:wpi="http://schemas.microsoft.com/office/word/2010/wordprocessingInk" xmlns:wne="http://schemas.microsoft.com/office/word/2006/wordml" xmlns:wps="http://schemas.microsoft.com/office/word/2010/wordprocessingShape" mc:Ignorable="w14 w15 w16se w16cid w16 w16cex w16sdtdh w16sdtfl w16du wp14">
   <w:numPicBullet w:numPicBulletId="0">
     <w:pict>
-      <v:rect id="_x0000_i1045" style="width:0;height:1.5pt" o:hralign="center" o:bullet="t" o:hrstd="t" o:hr="t" fillcolor="#a0a0a0" stroked="f"/>
+      <v:rect id="_x0000_i1032" style="width:0;height:1.5pt" o:hralign="center" o:bullet="t" o:hrstd="t" o:hr="t" fillcolor="#a0a0a0" stroked="f"/>
     </w:pict>
   </w:numPicBullet>
   <w:abstractNum w:abstractNumId="0" w15:restartNumberingAfterBreak="0">
@@ -37747,6 +37127,7 @@
   <w:style w:type="character" w:default="1" w:styleId="DefaultParagraphFont">
     <w:name w:val="Default Paragraph Font"/>
     <w:uiPriority w:val="1"/>
+    <w:semiHidden/>
     <w:unhideWhenUsed/>
   </w:style>
   <w:style w:type="table" w:default="1" w:styleId="TableNormal">

</xml_diff>